<commit_message>
Update docente questionnaire: refine usability questions and responses, enhance clarity in comparison with traditional attendance methods, and address potential internet connectivity issues.
</commit_message>
<xml_diff>
--- a/docs/piloto/cuestionario-docente.docx
+++ b/docs/piloto/cuestionario-docente.docx
@@ -1,64 +1,51 @@
 
 <file path=word/document.xml><?xml version="1.0" encoding="utf-8"?>
-<w:document xmlns:wpc="http://schemas.microsoft.com/office/word/2010/wordprocessingCanvas" xmlns:cx="http://schemas.microsoft.com/office/drawing/2014/chartex" xmlns:cx1="http://schemas.microsoft.com/office/drawing/2015/9/8/chartex" xmlns:cx2="http://schemas.microsoft.com/office/drawing/2015/10/21/chartex" xmlns:cx3="http://schemas.microsoft.com/office/drawing/2016/5/9/chartex" xmlns:cx4="http://schemas.microsoft.com/office/drawing/2016/5/10/chartex" xmlns:cx5="http://schemas.microsoft.com/office/drawing/2016/5/11/chartex" xmlns:cx6="http://schemas.microsoft.com/office/drawing/2016/5/12/chartex" xmlns:cx7="http://schemas.microsoft.com/office/drawing/2016/5/13/chartex" xmlns:cx8="http://schemas.microsoft.com/office/drawing/2016/5/14/chartex" xmlns:mc="http://schemas.openxmlformats.org/markup-compatibility/2006" xmlns:aink="http://schemas.microsoft.com/office/drawing/2016/ink" xmlns:am3d="http://schemas.microsoft.com/office/drawing/2017/model3d" xmlns:o="urn:schemas-microsoft-com:office:office" xmlns:r="http://schemas.openxmlformats.org/officeDocument/2006/relationships" xmlns:m="http://schemas.openxmlformats.org/officeDocument/2006/math" xmlns:v="urn:schemas-microsoft-com:vml" xmlns:wp14="http://schemas.microsoft.com/office/word/2010/wordprocessingDrawing" xmlns:wp="http://schemas.openxmlformats.org/drawingml/2006/wordprocessingDrawing" xmlns:w10="urn:schemas-microsoft-com:office:word" xmlns:w="http://schemas.openxmlformats.org/wordprocessingml/2006/main" xmlns:w14="http://schemas.microsoft.com/office/word/2010/wordml" xmlns:w15="http://schemas.microsoft.com/office/word/2012/wordml" xmlns:w16cex="http://schemas.microsoft.com/office/word/2018/wordml/cex" xmlns:w16cid="http://schemas.microsoft.com/office/word/2016/wordml/cid" xmlns:w16="http://schemas.microsoft.com/office/word/2018/wordml" xmlns:w16sdtdh="http://schemas.microsoft.com/office/word/2020/wordml/sdtdatahash" xmlns:w16se="http://schemas.microsoft.com/office/word/2015/wordml/symex" xmlns:wpg="http://schemas.microsoft.com/office/word/2010/wordprocessingGroup" xmlns:wpi="http://schemas.microsoft.com/office/word/2010/wordprocessingInk" xmlns:wne="http://schemas.microsoft.com/office/word/2006/wordml" xmlns:wps="http://schemas.microsoft.com/office/word/2010/wordprocessingShape" mc:Ignorable="w14 w15 w16se w16cid w16 w16cex w16sdtdh wp14">
+<w:document xmlns:wpc="http://schemas.microsoft.com/office/word/2010/wordprocessingCanvas" xmlns:cx="http://schemas.microsoft.com/office/drawing/2014/chartex" xmlns:cx1="http://schemas.microsoft.com/office/drawing/2015/9/8/chartex" xmlns:cx2="http://schemas.microsoft.com/office/drawing/2015/10/21/chartex" xmlns:cx3="http://schemas.microsoft.com/office/drawing/2016/5/9/chartex" xmlns:cx4="http://schemas.microsoft.com/office/drawing/2016/5/10/chartex" xmlns:cx5="http://schemas.microsoft.com/office/drawing/2016/5/11/chartex" xmlns:cx6="http://schemas.microsoft.com/office/drawing/2016/5/12/chartex" xmlns:cx7="http://schemas.microsoft.com/office/drawing/2016/5/13/chartex" xmlns:cx8="http://schemas.microsoft.com/office/drawing/2016/5/14/chartex" xmlns:mc="http://schemas.openxmlformats.org/markup-compatibility/2006" xmlns:aink="http://schemas.microsoft.com/office/drawing/2016/ink" xmlns:am3d="http://schemas.microsoft.com/office/drawing/2017/model3d" xmlns:o="urn:schemas-microsoft-com:office:office" xmlns:oel="http://schemas.microsoft.com/office/2019/extlst" xmlns:r="http://schemas.openxmlformats.org/officeDocument/2006/relationships" xmlns:m="http://schemas.openxmlformats.org/officeDocument/2006/math" xmlns:v="urn:schemas-microsoft-com:vml" xmlns:wp14="http://schemas.microsoft.com/office/word/2010/wordprocessingDrawing" xmlns:wp="http://schemas.openxmlformats.org/drawingml/2006/wordprocessingDrawing" xmlns:w10="urn:schemas-microsoft-com:office:word" xmlns:w="http://schemas.openxmlformats.org/wordprocessingml/2006/main" xmlns:w14="http://schemas.microsoft.com/office/word/2010/wordml" xmlns:w15="http://schemas.microsoft.com/office/word/2012/wordml" xmlns:w16cex="http://schemas.microsoft.com/office/word/2018/wordml/cex" xmlns:w16cid="http://schemas.microsoft.com/office/word/2016/wordml/cid" xmlns:w16="http://schemas.microsoft.com/office/word/2018/wordml" xmlns:w16du="http://schemas.microsoft.com/office/word/2023/wordml/word16du" xmlns:w16sdtdh="http://schemas.microsoft.com/office/word/2020/wordml/sdtdatahash" xmlns:w16sdtfl="http://schemas.microsoft.com/office/word/2024/wordml/sdtformatlock" xmlns:w16se="http://schemas.microsoft.com/office/word/2015/wordml/symex" xmlns:wpg="http://schemas.microsoft.com/office/word/2010/wordprocessingGroup" xmlns:wpi="http://schemas.microsoft.com/office/word/2010/wordprocessingInk" xmlns:wne="http://schemas.microsoft.com/office/word/2006/wordml" xmlns:wps="http://schemas.microsoft.com/office/word/2010/wordprocessingShape" mc:Ignorable="w14 w15 w16se w16cid w16 w16cex w16sdtdh w16sdtfl w16du wp14">
   <w:body>
     <w:p>
       <w:pPr>
         <w:spacing w:after="40"/>
         <w:ind w:firstLine="720"/>
         <w:jc w:val="center"/>
-      </w:pPr>
-      <w:r>
         <w:rPr>
+          <w:rFonts w:ascii="Times New Roman" w:hAnsi="Times New Roman" w:cs="Times New Roman"/>
           <w:b/>
           <w:bCs/>
           <w:sz w:val="24"/>
           <w:szCs w:val="24"/>
         </w:rPr>
-        <w:t>UNIVERSIDAD NACIONAL MICAELA BASTIDAS DE APURÍMAC</w:t>
-      </w:r>
-    </w:p>
-    <w:p>
-      <w:pPr>
-        <w:spacing w:after="40"/>
-        <w:jc w:val="center"/>
-      </w:pPr>
-      <w:r>
-        <w:t>Facultad de Informática</w:t>
-      </w:r>
-    </w:p>
-    <w:p>
-      <w:pPr>
-        <w:spacing w:after="40"/>
-        <w:jc w:val="center"/>
-      </w:pPr>
-      <w:r>
-        <w:rPr>
-          <w:color w:val="555555"/>
-          <w:sz w:val="20"/>
-          <w:szCs w:val="20"/>
-        </w:rPr>
-        <w:t>Proyecto FAREAS · Prueba piloto del sistema de asistencia con reconocimiento facial</w:t>
-      </w:r>
-    </w:p>
-    <w:p>
-      <w:pPr>
-        <w:pBdr>
-          <w:bottom w:val="single" w:sz="8" w:space="4" w:color="1F3A5F"/>
-        </w:pBdr>
-        <w:spacing w:after="200"/>
       </w:pPr>
     </w:p>
     <w:p>
       <w:pPr>
-        <w:spacing w:before="120" w:after="60"/>
+        <w:spacing w:after="40" w:line="360" w:lineRule="auto"/>
+        <w:ind w:firstLine="720"/>
         <w:jc w:val="center"/>
+        <w:rPr>
+          <w:rFonts w:ascii="Times New Roman" w:hAnsi="Times New Roman" w:cs="Times New Roman"/>
+          <w:b/>
+          <w:bCs/>
+          <w:color w:val="000000" w:themeColor="text1"/>
+          <w:sz w:val="24"/>
+          <w:szCs w:val="24"/>
+        </w:rPr>
+      </w:pPr>
+    </w:p>
+    <w:p>
+      <w:pPr>
+        <w:spacing w:before="120" w:after="60" w:line="360" w:lineRule="auto"/>
+        <w:jc w:val="center"/>
+        <w:rPr>
+          <w:rFonts w:ascii="Times New Roman" w:hAnsi="Times New Roman" w:cs="Times New Roman"/>
+          <w:color w:val="000000" w:themeColor="text1"/>
+        </w:rPr>
       </w:pPr>
       <w:r>
         <w:rPr>
+          <w:rFonts w:ascii="Times New Roman" w:hAnsi="Times New Roman" w:cs="Times New Roman"/>
           <w:b/>
           <w:bCs/>
-          <w:color w:val="1F3A5F"/>
+          <w:color w:val="000000" w:themeColor="text1"/>
           <w:sz w:val="32"/>
           <w:szCs w:val="32"/>
         </w:rPr>
@@ -67,14 +54,19 @@
     </w:p>
     <w:p>
       <w:pPr>
-        <w:spacing w:after="240"/>
+        <w:spacing w:after="240" w:line="360" w:lineRule="auto"/>
         <w:jc w:val="center"/>
+        <w:rPr>
+          <w:rFonts w:ascii="Times New Roman" w:hAnsi="Times New Roman" w:cs="Times New Roman"/>
+          <w:color w:val="000000" w:themeColor="text1"/>
+        </w:rPr>
       </w:pPr>
       <w:r>
         <w:rPr>
-          <w:color w:val="555555"/>
+          <w:rFonts w:ascii="Times New Roman" w:hAnsi="Times New Roman" w:cs="Times New Roman"/>
+          <w:color w:val="000000" w:themeColor="text1"/>
         </w:rPr>
-        <w:t>Panel web de FAREAS · 28 / 10 / 2026</w:t>
+        <w:t>Panel web de FAREAS</w:t>
       </w:r>
     </w:p>
     <w:tbl>
@@ -112,8 +104,14 @@
             </w:tcMar>
           </w:tcPr>
           <w:p>
-            <w:r>
-              <w:rPr>
+            <w:pPr>
+              <w:rPr>
+                <w:rFonts w:ascii="Times New Roman" w:hAnsi="Times New Roman" w:cs="Times New Roman"/>
+              </w:rPr>
+            </w:pPr>
+            <w:r>
+              <w:rPr>
+                <w:rFonts w:ascii="Times New Roman" w:hAnsi="Times New Roman" w:cs="Times New Roman"/>
                 <w:b/>
                 <w:bCs/>
                 <w:sz w:val="20"/>
@@ -123,10 +121,27 @@
             </w:r>
             <w:r>
               <w:rPr>
+                <w:rFonts w:ascii="Times New Roman" w:hAnsi="Times New Roman" w:cs="Times New Roman"/>
                 <w:sz w:val="20"/>
                 <w:szCs w:val="20"/>
               </w:rPr>
-              <w:t>________________</w:t>
+              <w:t>He</w:t>
+            </w:r>
+            <w:r>
+              <w:rPr>
+                <w:rFonts w:ascii="Times New Roman" w:hAnsi="Times New Roman" w:cs="Times New Roman"/>
+                <w:sz w:val="20"/>
+                <w:szCs w:val="20"/>
+              </w:rPr>
+              <w:t>smeralda</w:t>
+            </w:r>
+            <w:r>
+              <w:rPr>
+                <w:rFonts w:ascii="Times New Roman" w:hAnsi="Times New Roman" w:cs="Times New Roman"/>
+                <w:sz w:val="20"/>
+                <w:szCs w:val="20"/>
+              </w:rPr>
+              <w:t xml:space="preserve"> Rojas Enríquez</w:t>
             </w:r>
           </w:p>
         </w:tc>
@@ -147,8 +162,14 @@
             </w:tcMar>
           </w:tcPr>
           <w:p>
-            <w:r>
-              <w:rPr>
+            <w:pPr>
+              <w:rPr>
+                <w:rFonts w:ascii="Times New Roman" w:hAnsi="Times New Roman" w:cs="Times New Roman"/>
+              </w:rPr>
+            </w:pPr>
+            <w:r>
+              <w:rPr>
+                <w:rFonts w:ascii="Times New Roman" w:hAnsi="Times New Roman" w:cs="Times New Roman"/>
                 <w:b/>
                 <w:bCs/>
                 <w:sz w:val="20"/>
@@ -158,6 +179,7 @@
             </w:r>
             <w:r>
               <w:rPr>
+                <w:rFonts w:ascii="Times New Roman" w:hAnsi="Times New Roman" w:cs="Times New Roman"/>
                 <w:sz w:val="20"/>
                 <w:szCs w:val="20"/>
               </w:rPr>
@@ -170,14 +192,21 @@
     <w:p>
       <w:pPr>
         <w:spacing w:after="60"/>
+        <w:rPr>
+          <w:rFonts w:ascii="Times New Roman" w:hAnsi="Times New Roman" w:cs="Times New Roman"/>
+        </w:rPr>
       </w:pPr>
     </w:p>
     <w:p>
       <w:pPr>
         <w:spacing w:after="120" w:line="276" w:lineRule="auto"/>
+        <w:rPr>
+          <w:rFonts w:ascii="Times New Roman" w:hAnsi="Times New Roman" w:cs="Times New Roman"/>
+        </w:rPr>
       </w:pPr>
       <w:r>
         <w:rPr>
+          <w:rFonts w:ascii="Times New Roman" w:hAnsi="Times New Roman" w:cs="Times New Roman"/>
           <w:b/>
           <w:bCs/>
         </w:rPr>
@@ -185,6 +214,7 @@
       </w:r>
       <w:r>
         <w:rPr>
+          <w:rFonts w:ascii="Times New Roman" w:hAnsi="Times New Roman" w:cs="Times New Roman"/>
           <w:sz w:val="21"/>
           <w:szCs w:val="21"/>
         </w:rPr>
@@ -194,20 +224,17 @@
     <w:p>
       <w:pPr>
         <w:spacing w:after="120" w:line="276" w:lineRule="auto"/>
+        <w:rPr>
+          <w:rFonts w:ascii="Times New Roman" w:hAnsi="Times New Roman" w:cs="Times New Roman"/>
+        </w:rPr>
       </w:pPr>
       <w:r>
         <w:rPr>
+          <w:rFonts w:ascii="Times New Roman" w:hAnsi="Times New Roman" w:cs="Times New Roman"/>
           <w:sz w:val="21"/>
           <w:szCs w:val="21"/>
         </w:rPr>
-        <w:t>Marque una casilla por fila: 1 = totalmente</w:t>
-      </w:r>
-      <w:r>
-        <w:rPr>
-          <w:sz w:val="21"/>
-          <w:szCs w:val="21"/>
-        </w:rPr>
-        <w:t xml:space="preserve"> en desacuerdo · 3 = neutral · 5 = totalmente de acuerdo.</w:t>
+        <w:t>Marque una casilla por fila: 1 = totalmente en desacuerdo · 3 = neutral · 5 = totalmente de acuerdo.</w:t>
       </w:r>
     </w:p>
     <w:tbl>
@@ -257,10 +284,13 @@
           <w:p>
             <w:pPr>
               <w:jc w:val="center"/>
-            </w:pPr>
-            <w:proofErr w:type="spellStart"/>
-            <w:r>
-              <w:rPr>
+              <w:rPr>
+                <w:rFonts w:ascii="Times New Roman" w:hAnsi="Times New Roman" w:cs="Times New Roman"/>
+              </w:rPr>
+            </w:pPr>
+            <w:r>
+              <w:rPr>
+                <w:rFonts w:ascii="Times New Roman" w:hAnsi="Times New Roman" w:cs="Times New Roman"/>
                 <w:b/>
                 <w:bCs/>
                 <w:sz w:val="20"/>
@@ -268,7 +298,6 @@
               </w:rPr>
               <w:t>N.°</w:t>
             </w:r>
-            <w:proofErr w:type="spellEnd"/>
           </w:p>
         </w:tc>
         <w:tc>
@@ -290,8 +319,14 @@
             <w:vAlign w:val="center"/>
           </w:tcPr>
           <w:p>
-            <w:r>
-              <w:rPr>
+            <w:pPr>
+              <w:rPr>
+                <w:rFonts w:ascii="Times New Roman" w:hAnsi="Times New Roman" w:cs="Times New Roman"/>
+              </w:rPr>
+            </w:pPr>
+            <w:r>
+              <w:rPr>
+                <w:rFonts w:ascii="Times New Roman" w:hAnsi="Times New Roman" w:cs="Times New Roman"/>
                 <w:b/>
                 <w:bCs/>
                 <w:sz w:val="20"/>
@@ -322,9 +357,13 @@
           <w:p>
             <w:pPr>
               <w:jc w:val="center"/>
-            </w:pPr>
-            <w:r>
-              <w:rPr>
+              <w:rPr>
+                <w:rFonts w:ascii="Times New Roman" w:hAnsi="Times New Roman" w:cs="Times New Roman"/>
+              </w:rPr>
+            </w:pPr>
+            <w:r>
+              <w:rPr>
+                <w:rFonts w:ascii="Times New Roman" w:hAnsi="Times New Roman" w:cs="Times New Roman"/>
                 <w:b/>
                 <w:bCs/>
                 <w:sz w:val="20"/>
@@ -355,9 +394,13 @@
           <w:p>
             <w:pPr>
               <w:jc w:val="center"/>
-            </w:pPr>
-            <w:r>
-              <w:rPr>
+              <w:rPr>
+                <w:rFonts w:ascii="Times New Roman" w:hAnsi="Times New Roman" w:cs="Times New Roman"/>
+              </w:rPr>
+            </w:pPr>
+            <w:r>
+              <w:rPr>
+                <w:rFonts w:ascii="Times New Roman" w:hAnsi="Times New Roman" w:cs="Times New Roman"/>
                 <w:b/>
                 <w:bCs/>
                 <w:sz w:val="20"/>
@@ -388,9 +431,13 @@
           <w:p>
             <w:pPr>
               <w:jc w:val="center"/>
-            </w:pPr>
-            <w:r>
-              <w:rPr>
+              <w:rPr>
+                <w:rFonts w:ascii="Times New Roman" w:hAnsi="Times New Roman" w:cs="Times New Roman"/>
+              </w:rPr>
+            </w:pPr>
+            <w:r>
+              <w:rPr>
+                <w:rFonts w:ascii="Times New Roman" w:hAnsi="Times New Roman" w:cs="Times New Roman"/>
                 <w:b/>
                 <w:bCs/>
                 <w:sz w:val="20"/>
@@ -421,9 +468,13 @@
           <w:p>
             <w:pPr>
               <w:jc w:val="center"/>
-            </w:pPr>
-            <w:r>
-              <w:rPr>
+              <w:rPr>
+                <w:rFonts w:ascii="Times New Roman" w:hAnsi="Times New Roman" w:cs="Times New Roman"/>
+              </w:rPr>
+            </w:pPr>
+            <w:r>
+              <w:rPr>
+                <w:rFonts w:ascii="Times New Roman" w:hAnsi="Times New Roman" w:cs="Times New Roman"/>
                 <w:b/>
                 <w:bCs/>
                 <w:sz w:val="20"/>
@@ -454,9 +505,13 @@
           <w:p>
             <w:pPr>
               <w:jc w:val="center"/>
-            </w:pPr>
-            <w:r>
-              <w:rPr>
+              <w:rPr>
+                <w:rFonts w:ascii="Times New Roman" w:hAnsi="Times New Roman" w:cs="Times New Roman"/>
+              </w:rPr>
+            </w:pPr>
+            <w:r>
+              <w:rPr>
+                <w:rFonts w:ascii="Times New Roman" w:hAnsi="Times New Roman" w:cs="Times New Roman"/>
                 <w:b/>
                 <w:bCs/>
                 <w:sz w:val="20"/>
@@ -491,9 +546,13 @@
           <w:p>
             <w:pPr>
               <w:jc w:val="center"/>
-            </w:pPr>
-            <w:r>
-              <w:rPr>
+              <w:rPr>
+                <w:rFonts w:ascii="Times New Roman" w:hAnsi="Times New Roman" w:cs="Times New Roman"/>
+              </w:rPr>
+            </w:pPr>
+            <w:r>
+              <w:rPr>
+                <w:rFonts w:ascii="Times New Roman" w:hAnsi="Times New Roman" w:cs="Times New Roman"/>
                 <w:sz w:val="20"/>
                 <w:szCs w:val="20"/>
               </w:rPr>
@@ -518,8 +577,14 @@
             </w:tcMar>
           </w:tcPr>
           <w:p>
-            <w:r>
-              <w:rPr>
+            <w:pPr>
+              <w:rPr>
+                <w:rFonts w:ascii="Times New Roman" w:hAnsi="Times New Roman" w:cs="Times New Roman"/>
+              </w:rPr>
+            </w:pPr>
+            <w:r>
+              <w:rPr>
+                <w:rFonts w:ascii="Times New Roman" w:hAnsi="Times New Roman" w:cs="Times New Roman"/>
                 <w:sz w:val="21"/>
                 <w:szCs w:val="21"/>
               </w:rPr>
@@ -547,9 +612,13 @@
           <w:p>
             <w:pPr>
               <w:jc w:val="center"/>
-            </w:pPr>
-            <w:r>
-              <w:rPr>
+              <w:rPr>
+                <w:rFonts w:ascii="Times New Roman" w:hAnsi="Times New Roman" w:cs="Times New Roman"/>
+              </w:rPr>
+            </w:pPr>
+            <w:r>
+              <w:rPr>
+                <w:rFonts w:ascii="Segoe UI Symbol" w:hAnsi="Segoe UI Symbol" w:cs="Segoe UI Symbol"/>
                 <w:sz w:val="32"/>
                 <w:szCs w:val="32"/>
               </w:rPr>
@@ -577,9 +646,13 @@
           <w:p>
             <w:pPr>
               <w:jc w:val="center"/>
-            </w:pPr>
-            <w:r>
-              <w:rPr>
+              <w:rPr>
+                <w:rFonts w:ascii="Times New Roman" w:hAnsi="Times New Roman" w:cs="Times New Roman"/>
+              </w:rPr>
+            </w:pPr>
+            <w:r>
+              <w:rPr>
+                <w:rFonts w:ascii="Segoe UI Symbol" w:hAnsi="Segoe UI Symbol" w:cs="Segoe UI Symbol"/>
                 <w:sz w:val="32"/>
                 <w:szCs w:val="32"/>
               </w:rPr>
@@ -607,9 +680,13 @@
           <w:p>
             <w:pPr>
               <w:jc w:val="center"/>
-            </w:pPr>
-            <w:r>
-              <w:rPr>
+              <w:rPr>
+                <w:rFonts w:ascii="Times New Roman" w:hAnsi="Times New Roman" w:cs="Times New Roman"/>
+              </w:rPr>
+            </w:pPr>
+            <w:r>
+              <w:rPr>
+                <w:rFonts w:ascii="Segoe UI Symbol" w:hAnsi="Segoe UI Symbol" w:cs="Segoe UI Symbol"/>
                 <w:sz w:val="32"/>
                 <w:szCs w:val="32"/>
               </w:rPr>
@@ -637,9 +714,15 @@
           <w:p>
             <w:pPr>
               <w:jc w:val="center"/>
-            </w:pPr>
-            <w:r>
-              <w:rPr>
+              <w:rPr>
+                <w:rFonts w:ascii="Segoe UI Symbol" w:hAnsi="Segoe UI Symbol" w:cs="Segoe UI Symbol"/>
+                <w:sz w:val="32"/>
+                <w:szCs w:val="32"/>
+              </w:rPr>
+            </w:pPr>
+            <w:r>
+              <w:rPr>
+                <w:rFonts w:ascii="Segoe UI Symbol" w:hAnsi="Segoe UI Symbol" w:cs="Segoe UI Symbol"/>
                 <w:sz w:val="32"/>
                 <w:szCs w:val="32"/>
               </w:rPr>
@@ -667,13 +750,19 @@
           <w:p>
             <w:pPr>
               <w:jc w:val="center"/>
-            </w:pPr>
-            <w:r>
-              <w:rPr>
-                <w:sz w:val="32"/>
-                <w:szCs w:val="32"/>
-              </w:rPr>
-              <w:t>☐</w:t>
+              <w:rPr>
+                <w:rFonts w:ascii="Segoe UI Symbol" w:hAnsi="Segoe UI Symbol" w:cs="Segoe UI Symbol"/>
+                <w:sz w:val="32"/>
+                <w:szCs w:val="32"/>
+              </w:rPr>
+            </w:pPr>
+            <w:r>
+              <w:rPr>
+                <w:rFonts w:ascii="Segoe UI Symbol" w:hAnsi="Segoe UI Symbol" w:cs="Segoe UI Symbol"/>
+                <w:sz w:val="32"/>
+                <w:szCs w:val="32"/>
+              </w:rPr>
+              <w:t>x</w:t>
             </w:r>
           </w:p>
         </w:tc>
@@ -702,9 +791,13 @@
           <w:p>
             <w:pPr>
               <w:jc w:val="center"/>
-            </w:pPr>
-            <w:r>
-              <w:rPr>
+              <w:rPr>
+                <w:rFonts w:ascii="Times New Roman" w:hAnsi="Times New Roman" w:cs="Times New Roman"/>
+              </w:rPr>
+            </w:pPr>
+            <w:r>
+              <w:rPr>
+                <w:rFonts w:ascii="Times New Roman" w:hAnsi="Times New Roman" w:cs="Times New Roman"/>
                 <w:sz w:val="20"/>
                 <w:szCs w:val="20"/>
               </w:rPr>
@@ -729,8 +822,14 @@
             </w:tcMar>
           </w:tcPr>
           <w:p>
-            <w:r>
-              <w:rPr>
+            <w:pPr>
+              <w:rPr>
+                <w:rFonts w:ascii="Times New Roman" w:hAnsi="Times New Roman" w:cs="Times New Roman"/>
+              </w:rPr>
+            </w:pPr>
+            <w:r>
+              <w:rPr>
+                <w:rFonts w:ascii="Times New Roman" w:hAnsi="Times New Roman" w:cs="Times New Roman"/>
                 <w:sz w:val="21"/>
                 <w:szCs w:val="21"/>
               </w:rPr>
@@ -758,9 +857,47 @@
           <w:p>
             <w:pPr>
               <w:jc w:val="center"/>
-            </w:pPr>
-            <w:r>
-              <w:rPr>
+              <w:rPr>
+                <w:rFonts w:ascii="Times New Roman" w:hAnsi="Times New Roman" w:cs="Times New Roman"/>
+              </w:rPr>
+            </w:pPr>
+            <w:r>
+              <w:rPr>
+                <w:rFonts w:ascii="Segoe UI Symbol" w:hAnsi="Segoe UI Symbol" w:cs="Segoe UI Symbol"/>
+                <w:sz w:val="32"/>
+                <w:szCs w:val="32"/>
+              </w:rPr>
+              <w:t>x</w:t>
+            </w:r>
+          </w:p>
+        </w:tc>
+        <w:tc>
+          <w:tcPr>
+            <w:tcW w:w="740" w:type="dxa"/>
+            <w:tcBorders>
+              <w:top w:val="single" w:sz="4" w:space="0" w:color="B8C0CC"/>
+              <w:left w:val="single" w:sz="4" w:space="0" w:color="B8C0CC"/>
+              <w:bottom w:val="single" w:sz="4" w:space="0" w:color="B8C0CC"/>
+              <w:right w:val="single" w:sz="4" w:space="0" w:color="B8C0CC"/>
+            </w:tcBorders>
+            <w:tcMar>
+              <w:top w:w="80" w:type="dxa"/>
+              <w:left w:w="110" w:type="dxa"/>
+              <w:bottom w:w="80" w:type="dxa"/>
+              <w:right w:w="110" w:type="dxa"/>
+            </w:tcMar>
+            <w:vAlign w:val="center"/>
+          </w:tcPr>
+          <w:p>
+            <w:pPr>
+              <w:jc w:val="center"/>
+              <w:rPr>
+                <w:rFonts w:ascii="Times New Roman" w:hAnsi="Times New Roman" w:cs="Times New Roman"/>
+              </w:rPr>
+            </w:pPr>
+            <w:r>
+              <w:rPr>
+                <w:rFonts w:ascii="Segoe UI Symbol" w:hAnsi="Segoe UI Symbol" w:cs="Segoe UI Symbol"/>
                 <w:sz w:val="32"/>
                 <w:szCs w:val="32"/>
               </w:rPr>
@@ -788,9 +925,13 @@
           <w:p>
             <w:pPr>
               <w:jc w:val="center"/>
-            </w:pPr>
-            <w:r>
-              <w:rPr>
+              <w:rPr>
+                <w:rFonts w:ascii="Times New Roman" w:hAnsi="Times New Roman" w:cs="Times New Roman"/>
+              </w:rPr>
+            </w:pPr>
+            <w:r>
+              <w:rPr>
+                <w:rFonts w:ascii="Segoe UI Symbol" w:hAnsi="Segoe UI Symbol" w:cs="Segoe UI Symbol"/>
                 <w:sz w:val="32"/>
                 <w:szCs w:val="32"/>
               </w:rPr>
@@ -818,9 +959,13 @@
           <w:p>
             <w:pPr>
               <w:jc w:val="center"/>
-            </w:pPr>
-            <w:r>
-              <w:rPr>
+              <w:rPr>
+                <w:rFonts w:ascii="Times New Roman" w:hAnsi="Times New Roman" w:cs="Times New Roman"/>
+              </w:rPr>
+            </w:pPr>
+            <w:r>
+              <w:rPr>
+                <w:rFonts w:ascii="Segoe UI Symbol" w:hAnsi="Segoe UI Symbol" w:cs="Segoe UI Symbol"/>
                 <w:sz w:val="32"/>
                 <w:szCs w:val="32"/>
               </w:rPr>
@@ -848,39 +993,13 @@
           <w:p>
             <w:pPr>
               <w:jc w:val="center"/>
-            </w:pPr>
-            <w:r>
-              <w:rPr>
-                <w:sz w:val="32"/>
-                <w:szCs w:val="32"/>
-              </w:rPr>
-              <w:t>☐</w:t>
-            </w:r>
-          </w:p>
-        </w:tc>
-        <w:tc>
-          <w:tcPr>
-            <w:tcW w:w="740" w:type="dxa"/>
-            <w:tcBorders>
-              <w:top w:val="single" w:sz="4" w:space="0" w:color="B8C0CC"/>
-              <w:left w:val="single" w:sz="4" w:space="0" w:color="B8C0CC"/>
-              <w:bottom w:val="single" w:sz="4" w:space="0" w:color="B8C0CC"/>
-              <w:right w:val="single" w:sz="4" w:space="0" w:color="B8C0CC"/>
-            </w:tcBorders>
-            <w:tcMar>
-              <w:top w:w="80" w:type="dxa"/>
-              <w:left w:w="110" w:type="dxa"/>
-              <w:bottom w:w="80" w:type="dxa"/>
-              <w:right w:w="110" w:type="dxa"/>
-            </w:tcMar>
-            <w:vAlign w:val="center"/>
-          </w:tcPr>
-          <w:p>
-            <w:pPr>
-              <w:jc w:val="center"/>
-            </w:pPr>
-            <w:r>
-              <w:rPr>
+              <w:rPr>
+                <w:rFonts w:ascii="Times New Roman" w:hAnsi="Times New Roman" w:cs="Times New Roman"/>
+              </w:rPr>
+            </w:pPr>
+            <w:r>
+              <w:rPr>
+                <w:rFonts w:ascii="Segoe UI Symbol" w:hAnsi="Segoe UI Symbol" w:cs="Segoe UI Symbol"/>
                 <w:sz w:val="32"/>
                 <w:szCs w:val="32"/>
               </w:rPr>
@@ -913,9 +1032,13 @@
           <w:p>
             <w:pPr>
               <w:jc w:val="center"/>
-            </w:pPr>
-            <w:r>
-              <w:rPr>
+              <w:rPr>
+                <w:rFonts w:ascii="Times New Roman" w:hAnsi="Times New Roman" w:cs="Times New Roman"/>
+              </w:rPr>
+            </w:pPr>
+            <w:r>
+              <w:rPr>
+                <w:rFonts w:ascii="Times New Roman" w:hAnsi="Times New Roman" w:cs="Times New Roman"/>
                 <w:sz w:val="20"/>
                 <w:szCs w:val="20"/>
               </w:rPr>
@@ -940,8 +1063,14 @@
             </w:tcMar>
           </w:tcPr>
           <w:p>
-            <w:r>
-              <w:rPr>
+            <w:pPr>
+              <w:rPr>
+                <w:rFonts w:ascii="Times New Roman" w:hAnsi="Times New Roman" w:cs="Times New Roman"/>
+              </w:rPr>
+            </w:pPr>
+            <w:r>
+              <w:rPr>
+                <w:rFonts w:ascii="Times New Roman" w:hAnsi="Times New Roman" w:cs="Times New Roman"/>
                 <w:sz w:val="21"/>
                 <w:szCs w:val="21"/>
               </w:rPr>
@@ -969,9 +1098,13 @@
           <w:p>
             <w:pPr>
               <w:jc w:val="center"/>
-            </w:pPr>
-            <w:r>
-              <w:rPr>
+              <w:rPr>
+                <w:rFonts w:ascii="Times New Roman" w:hAnsi="Times New Roman" w:cs="Times New Roman"/>
+              </w:rPr>
+            </w:pPr>
+            <w:r>
+              <w:rPr>
+                <w:rFonts w:ascii="Segoe UI Symbol" w:hAnsi="Segoe UI Symbol" w:cs="Segoe UI Symbol"/>
                 <w:sz w:val="32"/>
                 <w:szCs w:val="32"/>
               </w:rPr>
@@ -999,9 +1132,13 @@
           <w:p>
             <w:pPr>
               <w:jc w:val="center"/>
-            </w:pPr>
-            <w:r>
-              <w:rPr>
+              <w:rPr>
+                <w:rFonts w:ascii="Times New Roman" w:hAnsi="Times New Roman" w:cs="Times New Roman"/>
+              </w:rPr>
+            </w:pPr>
+            <w:r>
+              <w:rPr>
+                <w:rFonts w:ascii="Segoe UI Symbol" w:hAnsi="Segoe UI Symbol" w:cs="Segoe UI Symbol"/>
                 <w:sz w:val="32"/>
                 <w:szCs w:val="32"/>
               </w:rPr>
@@ -1029,9 +1166,13 @@
           <w:p>
             <w:pPr>
               <w:jc w:val="center"/>
-            </w:pPr>
-            <w:r>
-              <w:rPr>
+              <w:rPr>
+                <w:rFonts w:ascii="Times New Roman" w:hAnsi="Times New Roman" w:cs="Times New Roman"/>
+              </w:rPr>
+            </w:pPr>
+            <w:r>
+              <w:rPr>
+                <w:rFonts w:ascii="Segoe UI Symbol" w:hAnsi="Segoe UI Symbol" w:cs="Segoe UI Symbol"/>
                 <w:sz w:val="32"/>
                 <w:szCs w:val="32"/>
               </w:rPr>
@@ -1059,9 +1200,13 @@
           <w:p>
             <w:pPr>
               <w:jc w:val="center"/>
-            </w:pPr>
-            <w:r>
-              <w:rPr>
+              <w:rPr>
+                <w:rFonts w:ascii="Times New Roman" w:hAnsi="Times New Roman" w:cs="Times New Roman"/>
+              </w:rPr>
+            </w:pPr>
+            <w:r>
+              <w:rPr>
+                <w:rFonts w:ascii="Segoe UI Symbol" w:hAnsi="Segoe UI Symbol" w:cs="Segoe UI Symbol"/>
                 <w:sz w:val="32"/>
                 <w:szCs w:val="32"/>
               </w:rPr>
@@ -1089,13 +1234,17 @@
           <w:p>
             <w:pPr>
               <w:jc w:val="center"/>
-            </w:pPr>
-            <w:r>
-              <w:rPr>
-                <w:sz w:val="32"/>
-                <w:szCs w:val="32"/>
-              </w:rPr>
-              <w:t>☐</w:t>
+              <w:rPr>
+                <w:rFonts w:ascii="Times New Roman" w:hAnsi="Times New Roman" w:cs="Times New Roman"/>
+              </w:rPr>
+            </w:pPr>
+            <w:r>
+              <w:rPr>
+                <w:rFonts w:ascii="Segoe UI Symbol" w:hAnsi="Segoe UI Symbol" w:cs="Segoe UI Symbol"/>
+                <w:sz w:val="32"/>
+                <w:szCs w:val="32"/>
+              </w:rPr>
+              <w:t>x</w:t>
             </w:r>
           </w:p>
         </w:tc>
@@ -1124,9 +1273,13 @@
           <w:p>
             <w:pPr>
               <w:jc w:val="center"/>
-            </w:pPr>
-            <w:r>
-              <w:rPr>
+              <w:rPr>
+                <w:rFonts w:ascii="Times New Roman" w:hAnsi="Times New Roman" w:cs="Times New Roman"/>
+              </w:rPr>
+            </w:pPr>
+            <w:r>
+              <w:rPr>
+                <w:rFonts w:ascii="Times New Roman" w:hAnsi="Times New Roman" w:cs="Times New Roman"/>
                 <w:sz w:val="20"/>
                 <w:szCs w:val="20"/>
               </w:rPr>
@@ -1151,8 +1304,14 @@
             </w:tcMar>
           </w:tcPr>
           <w:p>
-            <w:r>
-              <w:rPr>
+            <w:pPr>
+              <w:rPr>
+                <w:rFonts w:ascii="Times New Roman" w:hAnsi="Times New Roman" w:cs="Times New Roman"/>
+              </w:rPr>
+            </w:pPr>
+            <w:r>
+              <w:rPr>
+                <w:rFonts w:ascii="Times New Roman" w:hAnsi="Times New Roman" w:cs="Times New Roman"/>
                 <w:sz w:val="21"/>
                 <w:szCs w:val="21"/>
               </w:rPr>
@@ -1180,9 +1339,47 @@
           <w:p>
             <w:pPr>
               <w:jc w:val="center"/>
-            </w:pPr>
-            <w:r>
-              <w:rPr>
+              <w:rPr>
+                <w:rFonts w:ascii="Times New Roman" w:hAnsi="Times New Roman" w:cs="Times New Roman"/>
+              </w:rPr>
+            </w:pPr>
+            <w:r>
+              <w:rPr>
+                <w:rFonts w:ascii="Segoe UI Symbol" w:hAnsi="Segoe UI Symbol" w:cs="Segoe UI Symbol"/>
+                <w:sz w:val="32"/>
+                <w:szCs w:val="32"/>
+              </w:rPr>
+              <w:t>x</w:t>
+            </w:r>
+          </w:p>
+        </w:tc>
+        <w:tc>
+          <w:tcPr>
+            <w:tcW w:w="740" w:type="dxa"/>
+            <w:tcBorders>
+              <w:top w:val="single" w:sz="4" w:space="0" w:color="B8C0CC"/>
+              <w:left w:val="single" w:sz="4" w:space="0" w:color="B8C0CC"/>
+              <w:bottom w:val="single" w:sz="4" w:space="0" w:color="B8C0CC"/>
+              <w:right w:val="single" w:sz="4" w:space="0" w:color="B8C0CC"/>
+            </w:tcBorders>
+            <w:tcMar>
+              <w:top w:w="80" w:type="dxa"/>
+              <w:left w:w="110" w:type="dxa"/>
+              <w:bottom w:w="80" w:type="dxa"/>
+              <w:right w:w="110" w:type="dxa"/>
+            </w:tcMar>
+            <w:vAlign w:val="center"/>
+          </w:tcPr>
+          <w:p>
+            <w:pPr>
+              <w:jc w:val="center"/>
+              <w:rPr>
+                <w:rFonts w:ascii="Times New Roman" w:hAnsi="Times New Roman" w:cs="Times New Roman"/>
+              </w:rPr>
+            </w:pPr>
+            <w:r>
+              <w:rPr>
+                <w:rFonts w:ascii="Segoe UI Symbol" w:hAnsi="Segoe UI Symbol" w:cs="Segoe UI Symbol"/>
                 <w:sz w:val="32"/>
                 <w:szCs w:val="32"/>
               </w:rPr>
@@ -1210,9 +1407,13 @@
           <w:p>
             <w:pPr>
               <w:jc w:val="center"/>
-            </w:pPr>
-            <w:r>
-              <w:rPr>
+              <w:rPr>
+                <w:rFonts w:ascii="Times New Roman" w:hAnsi="Times New Roman" w:cs="Times New Roman"/>
+              </w:rPr>
+            </w:pPr>
+            <w:r>
+              <w:rPr>
+                <w:rFonts w:ascii="Segoe UI Symbol" w:hAnsi="Segoe UI Symbol" w:cs="Segoe UI Symbol"/>
                 <w:sz w:val="32"/>
                 <w:szCs w:val="32"/>
               </w:rPr>
@@ -1240,9 +1441,13 @@
           <w:p>
             <w:pPr>
               <w:jc w:val="center"/>
-            </w:pPr>
-            <w:r>
-              <w:rPr>
+              <w:rPr>
+                <w:rFonts w:ascii="Times New Roman" w:hAnsi="Times New Roman" w:cs="Times New Roman"/>
+              </w:rPr>
+            </w:pPr>
+            <w:r>
+              <w:rPr>
+                <w:rFonts w:ascii="Segoe UI Symbol" w:hAnsi="Segoe UI Symbol" w:cs="Segoe UI Symbol"/>
                 <w:sz w:val="32"/>
                 <w:szCs w:val="32"/>
               </w:rPr>
@@ -1270,39 +1475,13 @@
           <w:p>
             <w:pPr>
               <w:jc w:val="center"/>
-            </w:pPr>
-            <w:r>
-              <w:rPr>
-                <w:sz w:val="32"/>
-                <w:szCs w:val="32"/>
-              </w:rPr>
-              <w:t>☐</w:t>
-            </w:r>
-          </w:p>
-        </w:tc>
-        <w:tc>
-          <w:tcPr>
-            <w:tcW w:w="740" w:type="dxa"/>
-            <w:tcBorders>
-              <w:top w:val="single" w:sz="4" w:space="0" w:color="B8C0CC"/>
-              <w:left w:val="single" w:sz="4" w:space="0" w:color="B8C0CC"/>
-              <w:bottom w:val="single" w:sz="4" w:space="0" w:color="B8C0CC"/>
-              <w:right w:val="single" w:sz="4" w:space="0" w:color="B8C0CC"/>
-            </w:tcBorders>
-            <w:tcMar>
-              <w:top w:w="80" w:type="dxa"/>
-              <w:left w:w="110" w:type="dxa"/>
-              <w:bottom w:w="80" w:type="dxa"/>
-              <w:right w:w="110" w:type="dxa"/>
-            </w:tcMar>
-            <w:vAlign w:val="center"/>
-          </w:tcPr>
-          <w:p>
-            <w:pPr>
-              <w:jc w:val="center"/>
-            </w:pPr>
-            <w:r>
-              <w:rPr>
+              <w:rPr>
+                <w:rFonts w:ascii="Times New Roman" w:hAnsi="Times New Roman" w:cs="Times New Roman"/>
+              </w:rPr>
+            </w:pPr>
+            <w:r>
+              <w:rPr>
+                <w:rFonts w:ascii="Segoe UI Symbol" w:hAnsi="Segoe UI Symbol" w:cs="Segoe UI Symbol"/>
                 <w:sz w:val="32"/>
                 <w:szCs w:val="32"/>
               </w:rPr>
@@ -1335,9 +1514,13 @@
           <w:p>
             <w:pPr>
               <w:jc w:val="center"/>
-            </w:pPr>
-            <w:r>
-              <w:rPr>
+              <w:rPr>
+                <w:rFonts w:ascii="Times New Roman" w:hAnsi="Times New Roman" w:cs="Times New Roman"/>
+              </w:rPr>
+            </w:pPr>
+            <w:r>
+              <w:rPr>
+                <w:rFonts w:ascii="Times New Roman" w:hAnsi="Times New Roman" w:cs="Times New Roman"/>
                 <w:sz w:val="20"/>
                 <w:szCs w:val="20"/>
               </w:rPr>
@@ -1362,8 +1545,14 @@
             </w:tcMar>
           </w:tcPr>
           <w:p>
-            <w:r>
-              <w:rPr>
+            <w:pPr>
+              <w:rPr>
+                <w:rFonts w:ascii="Times New Roman" w:hAnsi="Times New Roman" w:cs="Times New Roman"/>
+              </w:rPr>
+            </w:pPr>
+            <w:r>
+              <w:rPr>
+                <w:rFonts w:ascii="Times New Roman" w:hAnsi="Times New Roman" w:cs="Times New Roman"/>
                 <w:sz w:val="21"/>
                 <w:szCs w:val="21"/>
               </w:rPr>
@@ -1391,9 +1580,13 @@
           <w:p>
             <w:pPr>
               <w:jc w:val="center"/>
-            </w:pPr>
-            <w:r>
-              <w:rPr>
+              <w:rPr>
+                <w:rFonts w:ascii="Times New Roman" w:hAnsi="Times New Roman" w:cs="Times New Roman"/>
+              </w:rPr>
+            </w:pPr>
+            <w:r>
+              <w:rPr>
+                <w:rFonts w:ascii="Segoe UI Symbol" w:hAnsi="Segoe UI Symbol" w:cs="Segoe UI Symbol"/>
                 <w:sz w:val="32"/>
                 <w:szCs w:val="32"/>
               </w:rPr>
@@ -1421,9 +1614,13 @@
           <w:p>
             <w:pPr>
               <w:jc w:val="center"/>
-            </w:pPr>
-            <w:r>
-              <w:rPr>
+              <w:rPr>
+                <w:rFonts w:ascii="Times New Roman" w:hAnsi="Times New Roman" w:cs="Times New Roman"/>
+              </w:rPr>
+            </w:pPr>
+            <w:r>
+              <w:rPr>
+                <w:rFonts w:ascii="Segoe UI Symbol" w:hAnsi="Segoe UI Symbol" w:cs="Segoe UI Symbol"/>
                 <w:sz w:val="32"/>
                 <w:szCs w:val="32"/>
               </w:rPr>
@@ -1451,9 +1648,13 @@
           <w:p>
             <w:pPr>
               <w:jc w:val="center"/>
-            </w:pPr>
-            <w:r>
-              <w:rPr>
+              <w:rPr>
+                <w:rFonts w:ascii="Times New Roman" w:hAnsi="Times New Roman" w:cs="Times New Roman"/>
+              </w:rPr>
+            </w:pPr>
+            <w:r>
+              <w:rPr>
+                <w:rFonts w:ascii="Segoe UI Symbol" w:hAnsi="Segoe UI Symbol" w:cs="Segoe UI Symbol"/>
                 <w:sz w:val="32"/>
                 <w:szCs w:val="32"/>
               </w:rPr>
@@ -1481,9 +1682,13 @@
           <w:p>
             <w:pPr>
               <w:jc w:val="center"/>
-            </w:pPr>
-            <w:r>
-              <w:rPr>
+              <w:rPr>
+                <w:rFonts w:ascii="Times New Roman" w:hAnsi="Times New Roman" w:cs="Times New Roman"/>
+              </w:rPr>
+            </w:pPr>
+            <w:r>
+              <w:rPr>
+                <w:rFonts w:ascii="Segoe UI Symbol" w:hAnsi="Segoe UI Symbol" w:cs="Segoe UI Symbol"/>
                 <w:sz w:val="32"/>
                 <w:szCs w:val="32"/>
               </w:rPr>
@@ -1511,9 +1716,255 @@
           <w:p>
             <w:pPr>
               <w:jc w:val="center"/>
-            </w:pPr>
-            <w:r>
-              <w:rPr>
+              <w:rPr>
+                <w:rFonts w:ascii="Times New Roman" w:hAnsi="Times New Roman" w:cs="Times New Roman"/>
+              </w:rPr>
+            </w:pPr>
+            <w:r>
+              <w:rPr>
+                <w:rFonts w:ascii="Segoe UI Symbol" w:hAnsi="Segoe UI Symbol" w:cs="Segoe UI Symbol"/>
+                <w:sz w:val="32"/>
+                <w:szCs w:val="32"/>
+              </w:rPr>
+              <w:t>x</w:t>
+            </w:r>
+          </w:p>
+        </w:tc>
+      </w:tr>
+      <w:tr>
+        <w:trPr>
+          <w:cantSplit/>
+          <w:trHeight w:val="767"/>
+        </w:trPr>
+        <w:tc>
+          <w:tcPr>
+            <w:tcW w:w="600" w:type="dxa"/>
+            <w:tcBorders>
+              <w:top w:val="single" w:sz="4" w:space="0" w:color="B8C0CC"/>
+              <w:left w:val="single" w:sz="4" w:space="0" w:color="B8C0CC"/>
+              <w:bottom w:val="single" w:sz="4" w:space="0" w:color="B8C0CC"/>
+              <w:right w:val="single" w:sz="4" w:space="0" w:color="B8C0CC"/>
+            </w:tcBorders>
+            <w:tcMar>
+              <w:top w:w="80" w:type="dxa"/>
+              <w:left w:w="110" w:type="dxa"/>
+              <w:bottom w:w="80" w:type="dxa"/>
+              <w:right w:w="110" w:type="dxa"/>
+            </w:tcMar>
+            <w:vAlign w:val="center"/>
+          </w:tcPr>
+          <w:p>
+            <w:pPr>
+              <w:jc w:val="center"/>
+              <w:rPr>
+                <w:rFonts w:ascii="Times New Roman" w:hAnsi="Times New Roman" w:cs="Times New Roman"/>
+              </w:rPr>
+            </w:pPr>
+            <w:r>
+              <w:rPr>
+                <w:rFonts w:ascii="Times New Roman" w:hAnsi="Times New Roman" w:cs="Times New Roman"/>
+                <w:sz w:val="20"/>
+                <w:szCs w:val="20"/>
+              </w:rPr>
+              <w:t>6</w:t>
+            </w:r>
+          </w:p>
+        </w:tc>
+        <w:tc>
+          <w:tcPr>
+            <w:tcW w:w="5338" w:type="dxa"/>
+            <w:tcBorders>
+              <w:top w:val="single" w:sz="4" w:space="0" w:color="B8C0CC"/>
+              <w:left w:val="single" w:sz="4" w:space="0" w:color="B8C0CC"/>
+              <w:bottom w:val="single" w:sz="4" w:space="0" w:color="B8C0CC"/>
+              <w:right w:val="single" w:sz="4" w:space="0" w:color="B8C0CC"/>
+            </w:tcBorders>
+            <w:tcMar>
+              <w:top w:w="80" w:type="dxa"/>
+              <w:left w:w="110" w:type="dxa"/>
+              <w:bottom w:w="80" w:type="dxa"/>
+              <w:right w:w="110" w:type="dxa"/>
+            </w:tcMar>
+          </w:tcPr>
+          <w:p>
+            <w:pPr>
+              <w:rPr>
+                <w:rFonts w:ascii="Times New Roman" w:hAnsi="Times New Roman" w:cs="Times New Roman"/>
+              </w:rPr>
+            </w:pPr>
+            <w:r>
+              <w:rPr>
+                <w:rFonts w:ascii="Times New Roman" w:hAnsi="Times New Roman" w:cs="Times New Roman"/>
+                <w:sz w:val="21"/>
+                <w:szCs w:val="21"/>
+              </w:rPr>
+              <w:t>Considero que la herramienta presenta muchas contradicciones.</w:t>
+            </w:r>
+          </w:p>
+        </w:tc>
+        <w:tc>
+          <w:tcPr>
+            <w:tcW w:w="740" w:type="dxa"/>
+            <w:tcBorders>
+              <w:top w:val="single" w:sz="4" w:space="0" w:color="B8C0CC"/>
+              <w:left w:val="single" w:sz="4" w:space="0" w:color="B8C0CC"/>
+              <w:bottom w:val="single" w:sz="4" w:space="0" w:color="B8C0CC"/>
+              <w:right w:val="single" w:sz="4" w:space="0" w:color="B8C0CC"/>
+            </w:tcBorders>
+            <w:tcMar>
+              <w:top w:w="80" w:type="dxa"/>
+              <w:left w:w="110" w:type="dxa"/>
+              <w:bottom w:w="80" w:type="dxa"/>
+              <w:right w:w="110" w:type="dxa"/>
+            </w:tcMar>
+            <w:vAlign w:val="center"/>
+          </w:tcPr>
+          <w:p>
+            <w:pPr>
+              <w:jc w:val="center"/>
+              <w:rPr>
+                <w:rFonts w:ascii="Times New Roman" w:hAnsi="Times New Roman" w:cs="Times New Roman"/>
+              </w:rPr>
+            </w:pPr>
+            <w:r>
+              <w:rPr>
+                <w:rFonts w:ascii="Segoe UI Symbol" w:hAnsi="Segoe UI Symbol" w:cs="Segoe UI Symbol"/>
+                <w:sz w:val="32"/>
+                <w:szCs w:val="32"/>
+              </w:rPr>
+              <w:t>x</w:t>
+            </w:r>
+          </w:p>
+        </w:tc>
+        <w:tc>
+          <w:tcPr>
+            <w:tcW w:w="740" w:type="dxa"/>
+            <w:tcBorders>
+              <w:top w:val="single" w:sz="4" w:space="0" w:color="B8C0CC"/>
+              <w:left w:val="single" w:sz="4" w:space="0" w:color="B8C0CC"/>
+              <w:bottom w:val="single" w:sz="4" w:space="0" w:color="B8C0CC"/>
+              <w:right w:val="single" w:sz="4" w:space="0" w:color="B8C0CC"/>
+            </w:tcBorders>
+            <w:tcMar>
+              <w:top w:w="80" w:type="dxa"/>
+              <w:left w:w="110" w:type="dxa"/>
+              <w:bottom w:w="80" w:type="dxa"/>
+              <w:right w:w="110" w:type="dxa"/>
+            </w:tcMar>
+            <w:vAlign w:val="center"/>
+          </w:tcPr>
+          <w:p>
+            <w:pPr>
+              <w:jc w:val="center"/>
+              <w:rPr>
+                <w:rFonts w:ascii="Times New Roman" w:hAnsi="Times New Roman" w:cs="Times New Roman"/>
+              </w:rPr>
+            </w:pPr>
+            <w:r>
+              <w:rPr>
+                <w:rFonts w:ascii="Segoe UI Symbol" w:hAnsi="Segoe UI Symbol" w:cs="Segoe UI Symbol"/>
+                <w:sz w:val="32"/>
+                <w:szCs w:val="32"/>
+              </w:rPr>
+              <w:t>☐</w:t>
+            </w:r>
+          </w:p>
+        </w:tc>
+        <w:tc>
+          <w:tcPr>
+            <w:tcW w:w="740" w:type="dxa"/>
+            <w:tcBorders>
+              <w:top w:val="single" w:sz="4" w:space="0" w:color="B8C0CC"/>
+              <w:left w:val="single" w:sz="4" w:space="0" w:color="B8C0CC"/>
+              <w:bottom w:val="single" w:sz="4" w:space="0" w:color="B8C0CC"/>
+              <w:right w:val="single" w:sz="4" w:space="0" w:color="B8C0CC"/>
+            </w:tcBorders>
+            <w:tcMar>
+              <w:top w:w="80" w:type="dxa"/>
+              <w:left w:w="110" w:type="dxa"/>
+              <w:bottom w:w="80" w:type="dxa"/>
+              <w:right w:w="110" w:type="dxa"/>
+            </w:tcMar>
+            <w:vAlign w:val="center"/>
+          </w:tcPr>
+          <w:p>
+            <w:pPr>
+              <w:jc w:val="center"/>
+              <w:rPr>
+                <w:rFonts w:ascii="Times New Roman" w:hAnsi="Times New Roman" w:cs="Times New Roman"/>
+              </w:rPr>
+            </w:pPr>
+            <w:r>
+              <w:rPr>
+                <w:rFonts w:ascii="Segoe UI Symbol" w:hAnsi="Segoe UI Symbol" w:cs="Segoe UI Symbol"/>
+                <w:sz w:val="32"/>
+                <w:szCs w:val="32"/>
+              </w:rPr>
+              <w:t>☐</w:t>
+            </w:r>
+          </w:p>
+        </w:tc>
+        <w:tc>
+          <w:tcPr>
+            <w:tcW w:w="740" w:type="dxa"/>
+            <w:tcBorders>
+              <w:top w:val="single" w:sz="4" w:space="0" w:color="B8C0CC"/>
+              <w:left w:val="single" w:sz="4" w:space="0" w:color="B8C0CC"/>
+              <w:bottom w:val="single" w:sz="4" w:space="0" w:color="B8C0CC"/>
+              <w:right w:val="single" w:sz="4" w:space="0" w:color="B8C0CC"/>
+            </w:tcBorders>
+            <w:tcMar>
+              <w:top w:w="80" w:type="dxa"/>
+              <w:left w:w="110" w:type="dxa"/>
+              <w:bottom w:w="80" w:type="dxa"/>
+              <w:right w:w="110" w:type="dxa"/>
+            </w:tcMar>
+            <w:vAlign w:val="center"/>
+          </w:tcPr>
+          <w:p>
+            <w:pPr>
+              <w:jc w:val="center"/>
+              <w:rPr>
+                <w:rFonts w:ascii="Times New Roman" w:hAnsi="Times New Roman" w:cs="Times New Roman"/>
+              </w:rPr>
+            </w:pPr>
+            <w:r>
+              <w:rPr>
+                <w:rFonts w:ascii="Segoe UI Symbol" w:hAnsi="Segoe UI Symbol" w:cs="Segoe UI Symbol"/>
+                <w:sz w:val="32"/>
+                <w:szCs w:val="32"/>
+              </w:rPr>
+              <w:t>☐</w:t>
+            </w:r>
+          </w:p>
+        </w:tc>
+        <w:tc>
+          <w:tcPr>
+            <w:tcW w:w="740" w:type="dxa"/>
+            <w:tcBorders>
+              <w:top w:val="single" w:sz="4" w:space="0" w:color="B8C0CC"/>
+              <w:left w:val="single" w:sz="4" w:space="0" w:color="B8C0CC"/>
+              <w:bottom w:val="single" w:sz="4" w:space="0" w:color="B8C0CC"/>
+              <w:right w:val="single" w:sz="4" w:space="0" w:color="B8C0CC"/>
+            </w:tcBorders>
+            <w:tcMar>
+              <w:top w:w="80" w:type="dxa"/>
+              <w:left w:w="110" w:type="dxa"/>
+              <w:bottom w:w="80" w:type="dxa"/>
+              <w:right w:w="110" w:type="dxa"/>
+            </w:tcMar>
+            <w:vAlign w:val="center"/>
+          </w:tcPr>
+          <w:p>
+            <w:pPr>
+              <w:jc w:val="center"/>
+              <w:rPr>
+                <w:rFonts w:ascii="Times New Roman" w:hAnsi="Times New Roman" w:cs="Times New Roman"/>
+              </w:rPr>
+            </w:pPr>
+            <w:r>
+              <w:rPr>
+                <w:rFonts w:ascii="Segoe UI Symbol" w:hAnsi="Segoe UI Symbol" w:cs="Segoe UI Symbol"/>
                 <w:sz w:val="32"/>
                 <w:szCs w:val="32"/>
               </w:rPr>
@@ -1546,13 +1997,17 @@
           <w:p>
             <w:pPr>
               <w:jc w:val="center"/>
-            </w:pPr>
-            <w:r>
-              <w:rPr>
+              <w:rPr>
+                <w:rFonts w:ascii="Times New Roman" w:hAnsi="Times New Roman" w:cs="Times New Roman"/>
+              </w:rPr>
+            </w:pPr>
+            <w:r>
+              <w:rPr>
+                <w:rFonts w:ascii="Times New Roman" w:hAnsi="Times New Roman" w:cs="Times New Roman"/>
                 <w:sz w:val="20"/>
                 <w:szCs w:val="20"/>
               </w:rPr>
-              <w:t>6</w:t>
+              <w:t>7</w:t>
             </w:r>
           </w:p>
         </w:tc>
@@ -1573,38 +2028,48 @@
             </w:tcMar>
           </w:tcPr>
           <w:p>
-            <w:r>
-              <w:rPr>
+            <w:pPr>
+              <w:rPr>
+                <w:rFonts w:ascii="Times New Roman" w:hAnsi="Times New Roman" w:cs="Times New Roman"/>
+              </w:rPr>
+            </w:pPr>
+            <w:r>
+              <w:rPr>
+                <w:rFonts w:ascii="Times New Roman" w:hAnsi="Times New Roman" w:cs="Times New Roman"/>
                 <w:sz w:val="21"/>
                 <w:szCs w:val="21"/>
               </w:rPr>
-              <w:t>Considero que la herramienta presenta muchas contradicciones.</w:t>
-            </w:r>
-          </w:p>
-        </w:tc>
-        <w:tc>
-          <w:tcPr>
-            <w:tcW w:w="740" w:type="dxa"/>
-            <w:tcBorders>
-              <w:top w:val="single" w:sz="4" w:space="0" w:color="B8C0CC"/>
-              <w:left w:val="single" w:sz="4" w:space="0" w:color="B8C0CC"/>
-              <w:bottom w:val="single" w:sz="4" w:space="0" w:color="B8C0CC"/>
-              <w:right w:val="single" w:sz="4" w:space="0" w:color="B8C0CC"/>
-            </w:tcBorders>
-            <w:tcMar>
-              <w:top w:w="80" w:type="dxa"/>
-              <w:left w:w="110" w:type="dxa"/>
-              <w:bottom w:w="80" w:type="dxa"/>
-              <w:right w:w="110" w:type="dxa"/>
-            </w:tcMar>
-            <w:vAlign w:val="center"/>
-          </w:tcPr>
-          <w:p>
-            <w:pPr>
-              <w:jc w:val="center"/>
-            </w:pPr>
-            <w:r>
-              <w:rPr>
+              <w:t>Imagino que la mayoría de las personas aprenderían a usar esta herramienta rápidamente.</w:t>
+            </w:r>
+          </w:p>
+        </w:tc>
+        <w:tc>
+          <w:tcPr>
+            <w:tcW w:w="740" w:type="dxa"/>
+            <w:tcBorders>
+              <w:top w:val="single" w:sz="4" w:space="0" w:color="B8C0CC"/>
+              <w:left w:val="single" w:sz="4" w:space="0" w:color="B8C0CC"/>
+              <w:bottom w:val="single" w:sz="4" w:space="0" w:color="B8C0CC"/>
+              <w:right w:val="single" w:sz="4" w:space="0" w:color="B8C0CC"/>
+            </w:tcBorders>
+            <w:tcMar>
+              <w:top w:w="80" w:type="dxa"/>
+              <w:left w:w="110" w:type="dxa"/>
+              <w:bottom w:w="80" w:type="dxa"/>
+              <w:right w:w="110" w:type="dxa"/>
+            </w:tcMar>
+            <w:vAlign w:val="center"/>
+          </w:tcPr>
+          <w:p>
+            <w:pPr>
+              <w:jc w:val="center"/>
+              <w:rPr>
+                <w:rFonts w:ascii="Times New Roman" w:hAnsi="Times New Roman" w:cs="Times New Roman"/>
+              </w:rPr>
+            </w:pPr>
+            <w:r>
+              <w:rPr>
+                <w:rFonts w:ascii="Segoe UI Symbol" w:hAnsi="Segoe UI Symbol" w:cs="Segoe UI Symbol"/>
                 <w:sz w:val="32"/>
                 <w:szCs w:val="32"/>
               </w:rPr>
@@ -1632,9 +2097,13 @@
           <w:p>
             <w:pPr>
               <w:jc w:val="center"/>
-            </w:pPr>
-            <w:r>
-              <w:rPr>
+              <w:rPr>
+                <w:rFonts w:ascii="Times New Roman" w:hAnsi="Times New Roman" w:cs="Times New Roman"/>
+              </w:rPr>
+            </w:pPr>
+            <w:r>
+              <w:rPr>
+                <w:rFonts w:ascii="Segoe UI Symbol" w:hAnsi="Segoe UI Symbol" w:cs="Segoe UI Symbol"/>
                 <w:sz w:val="32"/>
                 <w:szCs w:val="32"/>
               </w:rPr>
@@ -1662,9 +2131,13 @@
           <w:p>
             <w:pPr>
               <w:jc w:val="center"/>
-            </w:pPr>
-            <w:r>
-              <w:rPr>
+              <w:rPr>
+                <w:rFonts w:ascii="Times New Roman" w:hAnsi="Times New Roman" w:cs="Times New Roman"/>
+              </w:rPr>
+            </w:pPr>
+            <w:r>
+              <w:rPr>
+                <w:rFonts w:ascii="Segoe UI Symbol" w:hAnsi="Segoe UI Symbol" w:cs="Segoe UI Symbol"/>
                 <w:sz w:val="32"/>
                 <w:szCs w:val="32"/>
               </w:rPr>
@@ -1692,9 +2165,13 @@
           <w:p>
             <w:pPr>
               <w:jc w:val="center"/>
-            </w:pPr>
-            <w:r>
-              <w:rPr>
+              <w:rPr>
+                <w:rFonts w:ascii="Times New Roman" w:hAnsi="Times New Roman" w:cs="Times New Roman"/>
+              </w:rPr>
+            </w:pPr>
+            <w:r>
+              <w:rPr>
+                <w:rFonts w:ascii="Segoe UI Symbol" w:hAnsi="Segoe UI Symbol" w:cs="Segoe UI Symbol"/>
                 <w:sz w:val="32"/>
                 <w:szCs w:val="32"/>
               </w:rPr>
@@ -1722,13 +2199,17 @@
           <w:p>
             <w:pPr>
               <w:jc w:val="center"/>
-            </w:pPr>
-            <w:r>
-              <w:rPr>
-                <w:sz w:val="32"/>
-                <w:szCs w:val="32"/>
-              </w:rPr>
-              <w:t>☐</w:t>
+              <w:rPr>
+                <w:rFonts w:ascii="Times New Roman" w:hAnsi="Times New Roman" w:cs="Times New Roman"/>
+              </w:rPr>
+            </w:pPr>
+            <w:r>
+              <w:rPr>
+                <w:rFonts w:ascii="Segoe UI Symbol" w:hAnsi="Segoe UI Symbol" w:cs="Segoe UI Symbol"/>
+                <w:sz w:val="32"/>
+                <w:szCs w:val="32"/>
+              </w:rPr>
+              <w:t>x</w:t>
             </w:r>
           </w:p>
         </w:tc>
@@ -1757,13 +2238,17 @@
           <w:p>
             <w:pPr>
               <w:jc w:val="center"/>
-            </w:pPr>
-            <w:r>
-              <w:rPr>
+              <w:rPr>
+                <w:rFonts w:ascii="Times New Roman" w:hAnsi="Times New Roman" w:cs="Times New Roman"/>
+              </w:rPr>
+            </w:pPr>
+            <w:r>
+              <w:rPr>
+                <w:rFonts w:ascii="Times New Roman" w:hAnsi="Times New Roman" w:cs="Times New Roman"/>
                 <w:sz w:val="20"/>
                 <w:szCs w:val="20"/>
               </w:rPr>
-              <w:t>7</w:t>
+              <w:t>8</w:t>
             </w:r>
           </w:p>
         </w:tc>
@@ -1784,38 +2269,82 @@
             </w:tcMar>
           </w:tcPr>
           <w:p>
-            <w:r>
-              <w:rPr>
+            <w:pPr>
+              <w:rPr>
+                <w:rFonts w:ascii="Times New Roman" w:hAnsi="Times New Roman" w:cs="Times New Roman"/>
+              </w:rPr>
+            </w:pPr>
+            <w:r>
+              <w:rPr>
+                <w:rFonts w:ascii="Times New Roman" w:hAnsi="Times New Roman" w:cs="Times New Roman"/>
                 <w:sz w:val="21"/>
                 <w:szCs w:val="21"/>
               </w:rPr>
-              <w:t>Imagino que la mayoría de las personas aprenderían a usar esta herramienta rápidamente.</w:t>
-            </w:r>
-          </w:p>
-        </w:tc>
-        <w:tc>
-          <w:tcPr>
-            <w:tcW w:w="740" w:type="dxa"/>
-            <w:tcBorders>
-              <w:top w:val="single" w:sz="4" w:space="0" w:color="B8C0CC"/>
-              <w:left w:val="single" w:sz="4" w:space="0" w:color="B8C0CC"/>
-              <w:bottom w:val="single" w:sz="4" w:space="0" w:color="B8C0CC"/>
-              <w:right w:val="single" w:sz="4" w:space="0" w:color="B8C0CC"/>
-            </w:tcBorders>
-            <w:tcMar>
-              <w:top w:w="80" w:type="dxa"/>
-              <w:left w:w="110" w:type="dxa"/>
-              <w:bottom w:w="80" w:type="dxa"/>
-              <w:right w:w="110" w:type="dxa"/>
-            </w:tcMar>
-            <w:vAlign w:val="center"/>
-          </w:tcPr>
-          <w:p>
-            <w:pPr>
-              <w:jc w:val="center"/>
-            </w:pPr>
-            <w:r>
-              <w:rPr>
+              <w:t>Considero que el uso de esta herramienta es tedioso.</w:t>
+            </w:r>
+          </w:p>
+        </w:tc>
+        <w:tc>
+          <w:tcPr>
+            <w:tcW w:w="740" w:type="dxa"/>
+            <w:tcBorders>
+              <w:top w:val="single" w:sz="4" w:space="0" w:color="B8C0CC"/>
+              <w:left w:val="single" w:sz="4" w:space="0" w:color="B8C0CC"/>
+              <w:bottom w:val="single" w:sz="4" w:space="0" w:color="B8C0CC"/>
+              <w:right w:val="single" w:sz="4" w:space="0" w:color="B8C0CC"/>
+            </w:tcBorders>
+            <w:tcMar>
+              <w:top w:w="80" w:type="dxa"/>
+              <w:left w:w="110" w:type="dxa"/>
+              <w:bottom w:w="80" w:type="dxa"/>
+              <w:right w:w="110" w:type="dxa"/>
+            </w:tcMar>
+            <w:vAlign w:val="center"/>
+          </w:tcPr>
+          <w:p>
+            <w:pPr>
+              <w:jc w:val="center"/>
+              <w:rPr>
+                <w:rFonts w:ascii="Times New Roman" w:hAnsi="Times New Roman" w:cs="Times New Roman"/>
+              </w:rPr>
+            </w:pPr>
+            <w:r>
+              <w:rPr>
+                <w:rFonts w:ascii="Segoe UI Symbol" w:hAnsi="Segoe UI Symbol" w:cs="Segoe UI Symbol"/>
+                <w:sz w:val="32"/>
+                <w:szCs w:val="32"/>
+              </w:rPr>
+              <w:t>x</w:t>
+            </w:r>
+          </w:p>
+        </w:tc>
+        <w:tc>
+          <w:tcPr>
+            <w:tcW w:w="740" w:type="dxa"/>
+            <w:tcBorders>
+              <w:top w:val="single" w:sz="4" w:space="0" w:color="B8C0CC"/>
+              <w:left w:val="single" w:sz="4" w:space="0" w:color="B8C0CC"/>
+              <w:bottom w:val="single" w:sz="4" w:space="0" w:color="B8C0CC"/>
+              <w:right w:val="single" w:sz="4" w:space="0" w:color="B8C0CC"/>
+            </w:tcBorders>
+            <w:tcMar>
+              <w:top w:w="80" w:type="dxa"/>
+              <w:left w:w="110" w:type="dxa"/>
+              <w:bottom w:w="80" w:type="dxa"/>
+              <w:right w:w="110" w:type="dxa"/>
+            </w:tcMar>
+            <w:vAlign w:val="center"/>
+          </w:tcPr>
+          <w:p>
+            <w:pPr>
+              <w:jc w:val="center"/>
+              <w:rPr>
+                <w:rFonts w:ascii="Times New Roman" w:hAnsi="Times New Roman" w:cs="Times New Roman"/>
+              </w:rPr>
+            </w:pPr>
+            <w:r>
+              <w:rPr>
+                <w:rFonts w:ascii="Segoe UI Symbol" w:hAnsi="Segoe UI Symbol" w:cs="Segoe UI Symbol"/>
                 <w:sz w:val="32"/>
                 <w:szCs w:val="32"/>
               </w:rPr>
@@ -1843,9 +2372,13 @@
           <w:p>
             <w:pPr>
               <w:jc w:val="center"/>
-            </w:pPr>
-            <w:r>
-              <w:rPr>
+              <w:rPr>
+                <w:rFonts w:ascii="Times New Roman" w:hAnsi="Times New Roman" w:cs="Times New Roman"/>
+              </w:rPr>
+            </w:pPr>
+            <w:r>
+              <w:rPr>
+                <w:rFonts w:ascii="Segoe UI Symbol" w:hAnsi="Segoe UI Symbol" w:cs="Segoe UI Symbol"/>
                 <w:sz w:val="32"/>
                 <w:szCs w:val="32"/>
               </w:rPr>
@@ -1873,9 +2406,13 @@
           <w:p>
             <w:pPr>
               <w:jc w:val="center"/>
-            </w:pPr>
-            <w:r>
-              <w:rPr>
+              <w:rPr>
+                <w:rFonts w:ascii="Times New Roman" w:hAnsi="Times New Roman" w:cs="Times New Roman"/>
+              </w:rPr>
+            </w:pPr>
+            <w:r>
+              <w:rPr>
+                <w:rFonts w:ascii="Segoe UI Symbol" w:hAnsi="Segoe UI Symbol" w:cs="Segoe UI Symbol"/>
                 <w:sz w:val="32"/>
                 <w:szCs w:val="32"/>
               </w:rPr>
@@ -1903,39 +2440,13 @@
           <w:p>
             <w:pPr>
               <w:jc w:val="center"/>
-            </w:pPr>
-            <w:r>
-              <w:rPr>
-                <w:sz w:val="32"/>
-                <w:szCs w:val="32"/>
-              </w:rPr>
-              <w:t>☐</w:t>
-            </w:r>
-          </w:p>
-        </w:tc>
-        <w:tc>
-          <w:tcPr>
-            <w:tcW w:w="740" w:type="dxa"/>
-            <w:tcBorders>
-              <w:top w:val="single" w:sz="4" w:space="0" w:color="B8C0CC"/>
-              <w:left w:val="single" w:sz="4" w:space="0" w:color="B8C0CC"/>
-              <w:bottom w:val="single" w:sz="4" w:space="0" w:color="B8C0CC"/>
-              <w:right w:val="single" w:sz="4" w:space="0" w:color="B8C0CC"/>
-            </w:tcBorders>
-            <w:tcMar>
-              <w:top w:w="80" w:type="dxa"/>
-              <w:left w:w="110" w:type="dxa"/>
-              <w:bottom w:w="80" w:type="dxa"/>
-              <w:right w:w="110" w:type="dxa"/>
-            </w:tcMar>
-            <w:vAlign w:val="center"/>
-          </w:tcPr>
-          <w:p>
-            <w:pPr>
-              <w:jc w:val="center"/>
-            </w:pPr>
-            <w:r>
-              <w:rPr>
+              <w:rPr>
+                <w:rFonts w:ascii="Times New Roman" w:hAnsi="Times New Roman" w:cs="Times New Roman"/>
+              </w:rPr>
+            </w:pPr>
+            <w:r>
+              <w:rPr>
+                <w:rFonts w:ascii="Segoe UI Symbol" w:hAnsi="Segoe UI Symbol" w:cs="Segoe UI Symbol"/>
                 <w:sz w:val="32"/>
                 <w:szCs w:val="32"/>
               </w:rPr>
@@ -1968,13 +2479,17 @@
           <w:p>
             <w:pPr>
               <w:jc w:val="center"/>
-            </w:pPr>
-            <w:r>
-              <w:rPr>
+              <w:rPr>
+                <w:rFonts w:ascii="Times New Roman" w:hAnsi="Times New Roman" w:cs="Times New Roman"/>
+              </w:rPr>
+            </w:pPr>
+            <w:r>
+              <w:rPr>
+                <w:rFonts w:ascii="Times New Roman" w:hAnsi="Times New Roman" w:cs="Times New Roman"/>
                 <w:sz w:val="20"/>
                 <w:szCs w:val="20"/>
               </w:rPr>
-              <w:t>8</w:t>
+              <w:t>9</w:t>
             </w:r>
           </w:p>
         </w:tc>
@@ -1995,38 +2510,48 @@
             </w:tcMar>
           </w:tcPr>
           <w:p>
-            <w:r>
-              <w:rPr>
+            <w:pPr>
+              <w:rPr>
+                <w:rFonts w:ascii="Times New Roman" w:hAnsi="Times New Roman" w:cs="Times New Roman"/>
+              </w:rPr>
+            </w:pPr>
+            <w:r>
+              <w:rPr>
+                <w:rFonts w:ascii="Times New Roman" w:hAnsi="Times New Roman" w:cs="Times New Roman"/>
                 <w:sz w:val="21"/>
                 <w:szCs w:val="21"/>
               </w:rPr>
-              <w:t>Considero que el uso de esta herramienta es tedioso.</w:t>
-            </w:r>
-          </w:p>
-        </w:tc>
-        <w:tc>
-          <w:tcPr>
-            <w:tcW w:w="740" w:type="dxa"/>
-            <w:tcBorders>
-              <w:top w:val="single" w:sz="4" w:space="0" w:color="B8C0CC"/>
-              <w:left w:val="single" w:sz="4" w:space="0" w:color="B8C0CC"/>
-              <w:bottom w:val="single" w:sz="4" w:space="0" w:color="B8C0CC"/>
-              <w:right w:val="single" w:sz="4" w:space="0" w:color="B8C0CC"/>
-            </w:tcBorders>
-            <w:tcMar>
-              <w:top w:w="80" w:type="dxa"/>
-              <w:left w:w="110" w:type="dxa"/>
-              <w:bottom w:w="80" w:type="dxa"/>
-              <w:right w:w="110" w:type="dxa"/>
-            </w:tcMar>
-            <w:vAlign w:val="center"/>
-          </w:tcPr>
-          <w:p>
-            <w:pPr>
-              <w:jc w:val="center"/>
-            </w:pPr>
-            <w:r>
-              <w:rPr>
+              <w:t>Me sentí muy confiado al usar la herramienta.</w:t>
+            </w:r>
+          </w:p>
+        </w:tc>
+        <w:tc>
+          <w:tcPr>
+            <w:tcW w:w="740" w:type="dxa"/>
+            <w:tcBorders>
+              <w:top w:val="single" w:sz="4" w:space="0" w:color="B8C0CC"/>
+              <w:left w:val="single" w:sz="4" w:space="0" w:color="B8C0CC"/>
+              <w:bottom w:val="single" w:sz="4" w:space="0" w:color="B8C0CC"/>
+              <w:right w:val="single" w:sz="4" w:space="0" w:color="B8C0CC"/>
+            </w:tcBorders>
+            <w:tcMar>
+              <w:top w:w="80" w:type="dxa"/>
+              <w:left w:w="110" w:type="dxa"/>
+              <w:bottom w:w="80" w:type="dxa"/>
+              <w:right w:w="110" w:type="dxa"/>
+            </w:tcMar>
+            <w:vAlign w:val="center"/>
+          </w:tcPr>
+          <w:p>
+            <w:pPr>
+              <w:jc w:val="center"/>
+              <w:rPr>
+                <w:rFonts w:ascii="Times New Roman" w:hAnsi="Times New Roman" w:cs="Times New Roman"/>
+              </w:rPr>
+            </w:pPr>
+            <w:r>
+              <w:rPr>
+                <w:rFonts w:ascii="Segoe UI Symbol" w:hAnsi="Segoe UI Symbol" w:cs="Segoe UI Symbol"/>
                 <w:sz w:val="32"/>
                 <w:szCs w:val="32"/>
               </w:rPr>
@@ -2054,9 +2579,13 @@
           <w:p>
             <w:pPr>
               <w:jc w:val="center"/>
-            </w:pPr>
-            <w:r>
-              <w:rPr>
+              <w:rPr>
+                <w:rFonts w:ascii="Times New Roman" w:hAnsi="Times New Roman" w:cs="Times New Roman"/>
+              </w:rPr>
+            </w:pPr>
+            <w:r>
+              <w:rPr>
+                <w:rFonts w:ascii="Segoe UI Symbol" w:hAnsi="Segoe UI Symbol" w:cs="Segoe UI Symbol"/>
                 <w:sz w:val="32"/>
                 <w:szCs w:val="32"/>
               </w:rPr>
@@ -2084,9 +2613,13 @@
           <w:p>
             <w:pPr>
               <w:jc w:val="center"/>
-            </w:pPr>
-            <w:r>
-              <w:rPr>
+              <w:rPr>
+                <w:rFonts w:ascii="Times New Roman" w:hAnsi="Times New Roman" w:cs="Times New Roman"/>
+              </w:rPr>
+            </w:pPr>
+            <w:r>
+              <w:rPr>
+                <w:rFonts w:ascii="Segoe UI Symbol" w:hAnsi="Segoe UI Symbol" w:cs="Segoe UI Symbol"/>
                 <w:sz w:val="32"/>
                 <w:szCs w:val="32"/>
               </w:rPr>
@@ -2114,39 +2647,47 @@
           <w:p>
             <w:pPr>
               <w:jc w:val="center"/>
-            </w:pPr>
-            <w:r>
-              <w:rPr>
-                <w:sz w:val="32"/>
-                <w:szCs w:val="32"/>
-              </w:rPr>
-              <w:t>☐</w:t>
-            </w:r>
-          </w:p>
-        </w:tc>
-        <w:tc>
-          <w:tcPr>
-            <w:tcW w:w="740" w:type="dxa"/>
-            <w:tcBorders>
-              <w:top w:val="single" w:sz="4" w:space="0" w:color="B8C0CC"/>
-              <w:left w:val="single" w:sz="4" w:space="0" w:color="B8C0CC"/>
-              <w:bottom w:val="single" w:sz="4" w:space="0" w:color="B8C0CC"/>
-              <w:right w:val="single" w:sz="4" w:space="0" w:color="B8C0CC"/>
-            </w:tcBorders>
-            <w:tcMar>
-              <w:top w:w="80" w:type="dxa"/>
-              <w:left w:w="110" w:type="dxa"/>
-              <w:bottom w:w="80" w:type="dxa"/>
-              <w:right w:w="110" w:type="dxa"/>
-            </w:tcMar>
-            <w:vAlign w:val="center"/>
-          </w:tcPr>
-          <w:p>
-            <w:pPr>
-              <w:jc w:val="center"/>
-            </w:pPr>
-            <w:r>
-              <w:rPr>
+              <w:rPr>
+                <w:rFonts w:ascii="Times New Roman" w:hAnsi="Times New Roman" w:cs="Times New Roman"/>
+              </w:rPr>
+            </w:pPr>
+            <w:r>
+              <w:rPr>
+                <w:rFonts w:ascii="Segoe UI Symbol" w:hAnsi="Segoe UI Symbol" w:cs="Segoe UI Symbol"/>
+                <w:sz w:val="32"/>
+                <w:szCs w:val="32"/>
+              </w:rPr>
+              <w:t>x</w:t>
+            </w:r>
+          </w:p>
+        </w:tc>
+        <w:tc>
+          <w:tcPr>
+            <w:tcW w:w="740" w:type="dxa"/>
+            <w:tcBorders>
+              <w:top w:val="single" w:sz="4" w:space="0" w:color="B8C0CC"/>
+              <w:left w:val="single" w:sz="4" w:space="0" w:color="B8C0CC"/>
+              <w:bottom w:val="single" w:sz="4" w:space="0" w:color="B8C0CC"/>
+              <w:right w:val="single" w:sz="4" w:space="0" w:color="B8C0CC"/>
+            </w:tcBorders>
+            <w:tcMar>
+              <w:top w:w="80" w:type="dxa"/>
+              <w:left w:w="110" w:type="dxa"/>
+              <w:bottom w:w="80" w:type="dxa"/>
+              <w:right w:w="110" w:type="dxa"/>
+            </w:tcMar>
+            <w:vAlign w:val="center"/>
+          </w:tcPr>
+          <w:p>
+            <w:pPr>
+              <w:jc w:val="center"/>
+              <w:rPr>
+                <w:rFonts w:ascii="Times New Roman" w:hAnsi="Times New Roman" w:cs="Times New Roman"/>
+              </w:rPr>
+            </w:pPr>
+            <w:r>
+              <w:rPr>
+                <w:rFonts w:ascii="Segoe UI Symbol" w:hAnsi="Segoe UI Symbol" w:cs="Segoe UI Symbol"/>
                 <w:sz w:val="32"/>
                 <w:szCs w:val="32"/>
               </w:rPr>
@@ -2179,13 +2720,17 @@
           <w:p>
             <w:pPr>
               <w:jc w:val="center"/>
-            </w:pPr>
-            <w:r>
-              <w:rPr>
+              <w:rPr>
+                <w:rFonts w:ascii="Times New Roman" w:hAnsi="Times New Roman" w:cs="Times New Roman"/>
+              </w:rPr>
+            </w:pPr>
+            <w:r>
+              <w:rPr>
+                <w:rFonts w:ascii="Times New Roman" w:hAnsi="Times New Roman" w:cs="Times New Roman"/>
                 <w:sz w:val="20"/>
                 <w:szCs w:val="20"/>
               </w:rPr>
-              <w:t>9</w:t>
+              <w:t>10</w:t>
             </w:r>
           </w:p>
         </w:tc>
@@ -2206,38 +2751,48 @@
             </w:tcMar>
           </w:tcPr>
           <w:p>
-            <w:r>
-              <w:rPr>
+            <w:pPr>
+              <w:rPr>
+                <w:rFonts w:ascii="Times New Roman" w:hAnsi="Times New Roman" w:cs="Times New Roman"/>
+              </w:rPr>
+            </w:pPr>
+            <w:r>
+              <w:rPr>
+                <w:rFonts w:ascii="Times New Roman" w:hAnsi="Times New Roman" w:cs="Times New Roman"/>
                 <w:sz w:val="21"/>
                 <w:szCs w:val="21"/>
               </w:rPr>
-              <w:t>Me sentí muy confiado al usar la herramienta.</w:t>
-            </w:r>
-          </w:p>
-        </w:tc>
-        <w:tc>
-          <w:tcPr>
-            <w:tcW w:w="740" w:type="dxa"/>
-            <w:tcBorders>
-              <w:top w:val="single" w:sz="4" w:space="0" w:color="B8C0CC"/>
-              <w:left w:val="single" w:sz="4" w:space="0" w:color="B8C0CC"/>
-              <w:bottom w:val="single" w:sz="4" w:space="0" w:color="B8C0CC"/>
-              <w:right w:val="single" w:sz="4" w:space="0" w:color="B8C0CC"/>
-            </w:tcBorders>
-            <w:tcMar>
-              <w:top w:w="80" w:type="dxa"/>
-              <w:left w:w="110" w:type="dxa"/>
-              <w:bottom w:w="80" w:type="dxa"/>
-              <w:right w:w="110" w:type="dxa"/>
-            </w:tcMar>
-            <w:vAlign w:val="center"/>
-          </w:tcPr>
-          <w:p>
-            <w:pPr>
-              <w:jc w:val="center"/>
-            </w:pPr>
-            <w:r>
-              <w:rPr>
+              <w:t>Necesité saber bastantes cosas antes de poder empezar a usar esta herramienta.</w:t>
+            </w:r>
+          </w:p>
+        </w:tc>
+        <w:tc>
+          <w:tcPr>
+            <w:tcW w:w="740" w:type="dxa"/>
+            <w:tcBorders>
+              <w:top w:val="single" w:sz="4" w:space="0" w:color="B8C0CC"/>
+              <w:left w:val="single" w:sz="4" w:space="0" w:color="B8C0CC"/>
+              <w:bottom w:val="single" w:sz="4" w:space="0" w:color="B8C0CC"/>
+              <w:right w:val="single" w:sz="4" w:space="0" w:color="B8C0CC"/>
+            </w:tcBorders>
+            <w:tcMar>
+              <w:top w:w="80" w:type="dxa"/>
+              <w:left w:w="110" w:type="dxa"/>
+              <w:bottom w:w="80" w:type="dxa"/>
+              <w:right w:w="110" w:type="dxa"/>
+            </w:tcMar>
+            <w:vAlign w:val="center"/>
+          </w:tcPr>
+          <w:p>
+            <w:pPr>
+              <w:jc w:val="center"/>
+              <w:rPr>
+                <w:rFonts w:ascii="Times New Roman" w:hAnsi="Times New Roman" w:cs="Times New Roman"/>
+              </w:rPr>
+            </w:pPr>
+            <w:r>
+              <w:rPr>
+                <w:rFonts w:ascii="Segoe UI Symbol" w:hAnsi="Segoe UI Symbol" w:cs="Segoe UI Symbol"/>
                 <w:sz w:val="32"/>
                 <w:szCs w:val="32"/>
               </w:rPr>
@@ -2265,9 +2820,13 @@
           <w:p>
             <w:pPr>
               <w:jc w:val="center"/>
-            </w:pPr>
-            <w:r>
-              <w:rPr>
+              <w:rPr>
+                <w:rFonts w:ascii="Times New Roman" w:hAnsi="Times New Roman" w:cs="Times New Roman"/>
+              </w:rPr>
+            </w:pPr>
+            <w:r>
+              <w:rPr>
+                <w:rFonts w:ascii="Segoe UI Symbol" w:hAnsi="Segoe UI Symbol" w:cs="Segoe UI Symbol"/>
                 <w:sz w:val="32"/>
                 <w:szCs w:val="32"/>
               </w:rPr>
@@ -2295,9 +2854,13 @@
           <w:p>
             <w:pPr>
               <w:jc w:val="center"/>
-            </w:pPr>
-            <w:r>
-              <w:rPr>
+              <w:rPr>
+                <w:rFonts w:ascii="Times New Roman" w:hAnsi="Times New Roman" w:cs="Times New Roman"/>
+              </w:rPr>
+            </w:pPr>
+            <w:r>
+              <w:rPr>
+                <w:rFonts w:ascii="Segoe UI Symbol" w:hAnsi="Segoe UI Symbol" w:cs="Segoe UI Symbol"/>
                 <w:sz w:val="32"/>
                 <w:szCs w:val="32"/>
               </w:rPr>
@@ -2325,9 +2888,13 @@
           <w:p>
             <w:pPr>
               <w:jc w:val="center"/>
-            </w:pPr>
-            <w:r>
-              <w:rPr>
+              <w:rPr>
+                <w:rFonts w:ascii="Times New Roman" w:hAnsi="Times New Roman" w:cs="Times New Roman"/>
+              </w:rPr>
+            </w:pPr>
+            <w:r>
+              <w:rPr>
+                <w:rFonts w:ascii="Segoe UI Symbol" w:hAnsi="Segoe UI Symbol" w:cs="Segoe UI Symbol"/>
                 <w:sz w:val="32"/>
                 <w:szCs w:val="32"/>
               </w:rPr>
@@ -2355,224 +2922,17 @@
           <w:p>
             <w:pPr>
               <w:jc w:val="center"/>
-            </w:pPr>
-            <w:r>
-              <w:rPr>
-                <w:sz w:val="32"/>
-                <w:szCs w:val="32"/>
-              </w:rPr>
-              <w:t>☐</w:t>
-            </w:r>
-          </w:p>
-        </w:tc>
-      </w:tr>
-      <w:tr>
-        <w:trPr>
-          <w:cantSplit/>
-        </w:trPr>
-        <w:tc>
-          <w:tcPr>
-            <w:tcW w:w="600" w:type="dxa"/>
-            <w:tcBorders>
-              <w:top w:val="single" w:sz="4" w:space="0" w:color="B8C0CC"/>
-              <w:left w:val="single" w:sz="4" w:space="0" w:color="B8C0CC"/>
-              <w:bottom w:val="single" w:sz="4" w:space="0" w:color="B8C0CC"/>
-              <w:right w:val="single" w:sz="4" w:space="0" w:color="B8C0CC"/>
-            </w:tcBorders>
-            <w:tcMar>
-              <w:top w:w="80" w:type="dxa"/>
-              <w:left w:w="110" w:type="dxa"/>
-              <w:bottom w:w="80" w:type="dxa"/>
-              <w:right w:w="110" w:type="dxa"/>
-            </w:tcMar>
-            <w:vAlign w:val="center"/>
-          </w:tcPr>
-          <w:p>
-            <w:pPr>
-              <w:jc w:val="center"/>
-            </w:pPr>
-            <w:r>
-              <w:rPr>
-                <w:sz w:val="20"/>
-                <w:szCs w:val="20"/>
-              </w:rPr>
-              <w:t>10</w:t>
-            </w:r>
-          </w:p>
-        </w:tc>
-        <w:tc>
-          <w:tcPr>
-            <w:tcW w:w="5338" w:type="dxa"/>
-            <w:tcBorders>
-              <w:top w:val="single" w:sz="4" w:space="0" w:color="B8C0CC"/>
-              <w:left w:val="single" w:sz="4" w:space="0" w:color="B8C0CC"/>
-              <w:bottom w:val="single" w:sz="4" w:space="0" w:color="B8C0CC"/>
-              <w:right w:val="single" w:sz="4" w:space="0" w:color="B8C0CC"/>
-            </w:tcBorders>
-            <w:tcMar>
-              <w:top w:w="80" w:type="dxa"/>
-              <w:left w:w="110" w:type="dxa"/>
-              <w:bottom w:w="80" w:type="dxa"/>
-              <w:right w:w="110" w:type="dxa"/>
-            </w:tcMar>
-          </w:tcPr>
-          <w:p>
-            <w:r>
-              <w:rPr>
-                <w:sz w:val="21"/>
-                <w:szCs w:val="21"/>
-              </w:rPr>
-              <w:t>Necesité saber bastantes cosas antes de poder empezar a usar esta herramienta.</w:t>
-            </w:r>
-          </w:p>
-        </w:tc>
-        <w:tc>
-          <w:tcPr>
-            <w:tcW w:w="740" w:type="dxa"/>
-            <w:tcBorders>
-              <w:top w:val="single" w:sz="4" w:space="0" w:color="B8C0CC"/>
-              <w:left w:val="single" w:sz="4" w:space="0" w:color="B8C0CC"/>
-              <w:bottom w:val="single" w:sz="4" w:space="0" w:color="B8C0CC"/>
-              <w:right w:val="single" w:sz="4" w:space="0" w:color="B8C0CC"/>
-            </w:tcBorders>
-            <w:tcMar>
-              <w:top w:w="80" w:type="dxa"/>
-              <w:left w:w="110" w:type="dxa"/>
-              <w:bottom w:w="80" w:type="dxa"/>
-              <w:right w:w="110" w:type="dxa"/>
-            </w:tcMar>
-            <w:vAlign w:val="center"/>
-          </w:tcPr>
-          <w:p>
-            <w:pPr>
-              <w:jc w:val="center"/>
-            </w:pPr>
-            <w:r>
-              <w:rPr>
-                <w:sz w:val="32"/>
-                <w:szCs w:val="32"/>
-              </w:rPr>
-              <w:t>☐</w:t>
-            </w:r>
-          </w:p>
-        </w:tc>
-        <w:tc>
-          <w:tcPr>
-            <w:tcW w:w="740" w:type="dxa"/>
-            <w:tcBorders>
-              <w:top w:val="single" w:sz="4" w:space="0" w:color="B8C0CC"/>
-              <w:left w:val="single" w:sz="4" w:space="0" w:color="B8C0CC"/>
-              <w:bottom w:val="single" w:sz="4" w:space="0" w:color="B8C0CC"/>
-              <w:right w:val="single" w:sz="4" w:space="0" w:color="B8C0CC"/>
-            </w:tcBorders>
-            <w:tcMar>
-              <w:top w:w="80" w:type="dxa"/>
-              <w:left w:w="110" w:type="dxa"/>
-              <w:bottom w:w="80" w:type="dxa"/>
-              <w:right w:w="110" w:type="dxa"/>
-            </w:tcMar>
-            <w:vAlign w:val="center"/>
-          </w:tcPr>
-          <w:p>
-            <w:pPr>
-              <w:jc w:val="center"/>
-            </w:pPr>
-            <w:r>
-              <w:rPr>
-                <w:sz w:val="32"/>
-                <w:szCs w:val="32"/>
-              </w:rPr>
-              <w:t>☐</w:t>
-            </w:r>
-          </w:p>
-        </w:tc>
-        <w:tc>
-          <w:tcPr>
-            <w:tcW w:w="740" w:type="dxa"/>
-            <w:tcBorders>
-              <w:top w:val="single" w:sz="4" w:space="0" w:color="B8C0CC"/>
-              <w:left w:val="single" w:sz="4" w:space="0" w:color="B8C0CC"/>
-              <w:bottom w:val="single" w:sz="4" w:space="0" w:color="B8C0CC"/>
-              <w:right w:val="single" w:sz="4" w:space="0" w:color="B8C0CC"/>
-            </w:tcBorders>
-            <w:tcMar>
-              <w:top w:w="80" w:type="dxa"/>
-              <w:left w:w="110" w:type="dxa"/>
-              <w:bottom w:w="80" w:type="dxa"/>
-              <w:right w:w="110" w:type="dxa"/>
-            </w:tcMar>
-            <w:vAlign w:val="center"/>
-          </w:tcPr>
-          <w:p>
-            <w:pPr>
-              <w:jc w:val="center"/>
-            </w:pPr>
-            <w:r>
-              <w:rPr>
-                <w:sz w:val="32"/>
-                <w:szCs w:val="32"/>
-              </w:rPr>
-              <w:t>☐</w:t>
-            </w:r>
-          </w:p>
-        </w:tc>
-        <w:tc>
-          <w:tcPr>
-            <w:tcW w:w="740" w:type="dxa"/>
-            <w:tcBorders>
-              <w:top w:val="single" w:sz="4" w:space="0" w:color="B8C0CC"/>
-              <w:left w:val="single" w:sz="4" w:space="0" w:color="B8C0CC"/>
-              <w:bottom w:val="single" w:sz="4" w:space="0" w:color="B8C0CC"/>
-              <w:right w:val="single" w:sz="4" w:space="0" w:color="B8C0CC"/>
-            </w:tcBorders>
-            <w:tcMar>
-              <w:top w:w="80" w:type="dxa"/>
-              <w:left w:w="110" w:type="dxa"/>
-              <w:bottom w:w="80" w:type="dxa"/>
-              <w:right w:w="110" w:type="dxa"/>
-            </w:tcMar>
-            <w:vAlign w:val="center"/>
-          </w:tcPr>
-          <w:p>
-            <w:pPr>
-              <w:jc w:val="center"/>
-            </w:pPr>
-            <w:r>
-              <w:rPr>
-                <w:sz w:val="32"/>
-                <w:szCs w:val="32"/>
-              </w:rPr>
-              <w:t>☐</w:t>
-            </w:r>
-          </w:p>
-        </w:tc>
-        <w:tc>
-          <w:tcPr>
-            <w:tcW w:w="740" w:type="dxa"/>
-            <w:tcBorders>
-              <w:top w:val="single" w:sz="4" w:space="0" w:color="B8C0CC"/>
-              <w:left w:val="single" w:sz="4" w:space="0" w:color="B8C0CC"/>
-              <w:bottom w:val="single" w:sz="4" w:space="0" w:color="B8C0CC"/>
-              <w:right w:val="single" w:sz="4" w:space="0" w:color="B8C0CC"/>
-            </w:tcBorders>
-            <w:tcMar>
-              <w:top w:w="80" w:type="dxa"/>
-              <w:left w:w="110" w:type="dxa"/>
-              <w:bottom w:w="80" w:type="dxa"/>
-              <w:right w:w="110" w:type="dxa"/>
-            </w:tcMar>
-            <w:vAlign w:val="center"/>
-          </w:tcPr>
-          <w:p>
-            <w:pPr>
-              <w:jc w:val="center"/>
-            </w:pPr>
-            <w:r>
-              <w:rPr>
-                <w:sz w:val="32"/>
-                <w:szCs w:val="32"/>
-              </w:rPr>
-              <w:t>☐</w:t>
+              <w:rPr>
+                <w:rFonts w:ascii="Times New Roman" w:hAnsi="Times New Roman" w:cs="Times New Roman"/>
+              </w:rPr>
+            </w:pPr>
+            <w:r>
+              <w:rPr>
+                <w:rFonts w:ascii="Segoe UI Symbol" w:hAnsi="Segoe UI Symbol" w:cs="Segoe UI Symbol"/>
+                <w:sz w:val="32"/>
+                <w:szCs w:val="32"/>
+              </w:rPr>
+              <w:t>x</w:t>
             </w:r>
           </w:p>
         </w:tc>
@@ -2581,9 +2941,13 @@
     <w:p>
       <w:pPr>
         <w:spacing w:before="200" w:after="80"/>
+        <w:rPr>
+          <w:rFonts w:ascii="Times New Roman" w:hAnsi="Times New Roman" w:cs="Times New Roman"/>
+        </w:rPr>
       </w:pPr>
       <w:r>
         <w:rPr>
+          <w:rFonts w:ascii="Times New Roman" w:hAnsi="Times New Roman" w:cs="Times New Roman"/>
           <w:b/>
           <w:bCs/>
         </w:rPr>
@@ -2592,73 +2956,108 @@
     </w:p>
     <w:p>
       <w:pPr>
-        <w:spacing w:after="120" w:line="276" w:lineRule="auto"/>
+        <w:pStyle w:val="Prrafodelista"/>
+        <w:numPr>
+          <w:ilvl w:val="0"/>
+          <w:numId w:val="2"/>
+        </w:numPr>
+        <w:spacing w:before="120" w:after="40"/>
+        <w:rPr>
+          <w:rFonts w:ascii="Times New Roman" w:hAnsi="Times New Roman" w:cs="Times New Roman"/>
+          <w:sz w:val="21"/>
+          <w:szCs w:val="21"/>
+        </w:rPr>
       </w:pPr>
       <w:r>
-        <w:t>_______________________________________________________________________</w:t>
-      </w:r>
-    </w:p>
-    <w:p>
-      <w:pPr>
-        <w:spacing w:after="120" w:line="276" w:lineRule="auto"/>
-      </w:pPr>
-      <w:r>
-        <w:t>_______________________________________________________________________</w:t>
+        <w:rPr>
+          <w:rFonts w:ascii="Times New Roman" w:hAnsi="Times New Roman" w:cs="Times New Roman"/>
+          <w:sz w:val="21"/>
+          <w:szCs w:val="21"/>
+        </w:rPr>
+        <w:t>¿Cómo compara el sistema con su forma habitual de tomar asistencia?</w:t>
       </w:r>
     </w:p>
     <w:p>
       <w:pPr>
         <w:spacing w:before="120" w:after="40"/>
+        <w:ind w:left="360"/>
+        <w:rPr>
+          <w:rFonts w:ascii="Times New Roman" w:hAnsi="Times New Roman" w:cs="Times New Roman"/>
+        </w:rPr>
       </w:pPr>
       <w:r>
         <w:rPr>
-          <w:sz w:val="21"/>
-          <w:szCs w:val="21"/>
+          <w:rFonts w:ascii="Times New Roman" w:hAnsi="Times New Roman" w:cs="Times New Roman"/>
         </w:rPr>
-        <w:t>1. ¿Cómo compara el sistema con su forma habitual de tomar asistencia?</w:t>
-      </w:r>
-    </w:p>
-    <w:p>
-      <w:pPr>
-        <w:spacing w:after="120" w:line="276" w:lineRule="auto"/>
-      </w:pPr>
-      <w:r>
-        <w:t>_______________________________________________________________________</w:t>
+        <w:t>La forma de utilizarlo es sencillo, las opciones están bien presentadas, no existe mucha diferencia con la forma de tomar asistencia de forma habitual. En mi caso, yo uso siempre una hoja de cálculo online (Google Docs Spreadsheet) que se publica dentro del Classroom del curso, además publico un enlace de la hoja de asistencia para que pueda ser visualizada en tiempo real por cualquier estudiante del curso, así ellos pueden hacer seguimiento a sus asistencias. Este tal vez sería una desventaja, ya que los alumnos no podrían ver su asistencia en tiempo real. Por otro lado, la herramienta presentada puede generar reportes agrupados, visualizar tendencias de comportamiento, prevenir que la asistencia sea más precisa. Particularmente me gustaría que se plantee la opción de crear un enlace público a fin de que pueda ser accesada por los estudiantes, ya que en educación es importante transparentar las calificaciones.</w:t>
       </w:r>
     </w:p>
     <w:p>
       <w:pPr>
         <w:spacing w:before="120" w:after="40"/>
+        <w:ind w:left="360"/>
+        <w:rPr>
+          <w:rFonts w:ascii="Times New Roman" w:hAnsi="Times New Roman" w:cs="Times New Roman"/>
+        </w:rPr>
       </w:pPr>
       <w:r>
         <w:rPr>
-          <w:sz w:val="21"/>
-          <w:szCs w:val="21"/>
+          <w:rFonts w:ascii="Times New Roman" w:hAnsi="Times New Roman" w:cs="Times New Roman"/>
         </w:rPr>
-        <w:t xml:space="preserve">2. ¿Qué situaciones de la clase hicieron </w:t>
-      </w:r>
-      <w:r>
-        <w:rPr>
-          <w:sz w:val="21"/>
-          <w:szCs w:val="21"/>
-        </w:rPr>
-        <w:t>que el sistema fallara o generara dudas?</w:t>
-      </w:r>
-    </w:p>
-    <w:p>
-      <w:pPr>
-        <w:spacing w:after="120" w:line="276" w:lineRule="auto"/>
-      </w:pPr>
-      <w:r>
-        <w:t>_______________________________________________________________________</w:t>
+        <w:t xml:space="preserve"> </w:t>
       </w:r>
     </w:p>
     <w:p>
       <w:pPr>
         <w:spacing w:before="120" w:after="40"/>
+        <w:rPr>
+          <w:rFonts w:ascii="Times New Roman" w:hAnsi="Times New Roman" w:cs="Times New Roman"/>
+        </w:rPr>
       </w:pPr>
       <w:r>
         <w:rPr>
+          <w:rFonts w:ascii="Times New Roman" w:hAnsi="Times New Roman" w:cs="Times New Roman"/>
+          <w:sz w:val="21"/>
+          <w:szCs w:val="21"/>
+        </w:rPr>
+        <w:lastRenderedPageBreak/>
+        <w:t>2. ¿Qué situaciones de la clase hicieron que el sistema fallara o generara dudas?</w:t>
+      </w:r>
+    </w:p>
+    <w:p>
+      <w:pPr>
+        <w:spacing w:before="120" w:after="40"/>
+        <w:ind w:left="360"/>
+        <w:rPr>
+          <w:rFonts w:ascii="Times New Roman" w:hAnsi="Times New Roman" w:cs="Times New Roman"/>
+        </w:rPr>
+      </w:pPr>
+      <w:r>
+        <w:rPr>
+          <w:rFonts w:ascii="Times New Roman" w:hAnsi="Times New Roman" w:cs="Times New Roman"/>
+        </w:rPr>
+        <w:t>La conexión a internet puede fallar en cualquier momento, mientras que un registro manual no. Sin embargo, son situaciones muy excepcionales, que se aplicarían a cualquier sistema, por lo que igual es recomendable seguir con la herramienta propuesta.</w:t>
+      </w:r>
+    </w:p>
+    <w:p>
+      <w:pPr>
+        <w:spacing w:before="120" w:after="40"/>
+        <w:ind w:left="360"/>
+        <w:rPr>
+          <w:rFonts w:ascii="Times New Roman" w:hAnsi="Times New Roman" w:cs="Times New Roman"/>
+        </w:rPr>
+      </w:pPr>
+    </w:p>
+    <w:p>
+      <w:pPr>
+        <w:spacing w:before="120" w:after="40"/>
+        <w:rPr>
+          <w:rFonts w:ascii="Times New Roman" w:hAnsi="Times New Roman" w:cs="Times New Roman"/>
+        </w:rPr>
+      </w:pPr>
+      <w:r>
+        <w:rPr>
+          <w:rFonts w:ascii="Times New Roman" w:hAnsi="Times New Roman" w:cs="Times New Roman"/>
           <w:sz w:val="21"/>
           <w:szCs w:val="21"/>
         </w:rPr>
@@ -2667,15 +3066,22 @@
     </w:p>
     <w:p>
       <w:pPr>
-        <w:spacing w:after="120" w:line="276" w:lineRule="auto"/>
+        <w:spacing w:before="120" w:after="40"/>
+        <w:ind w:left="360"/>
+        <w:rPr>
+          <w:rFonts w:ascii="Times New Roman" w:hAnsi="Times New Roman" w:cs="Times New Roman"/>
+        </w:rPr>
       </w:pPr>
       <w:r>
-        <w:lastRenderedPageBreak/>
-        <w:t>_______________________________________________________________________</w:t>
+        <w:rPr>
+          <w:rFonts w:ascii="Times New Roman" w:hAnsi="Times New Roman" w:cs="Times New Roman"/>
+        </w:rPr>
+        <w:t>Nada en particular.</w:t>
       </w:r>
     </w:p>
     <w:sectPr>
-      <w:footerReference w:type="default" r:id="rId7"/>
+      <w:headerReference w:type="default" r:id="rId7"/>
+      <w:footerReference w:type="default" r:id="rId8"/>
       <w:pgSz w:w="11906" w:h="16838"/>
       <w:pgMar w:top="1134" w:right="1134" w:bottom="1134" w:left="1134" w:header="708" w:footer="708" w:gutter="0"/>
       <w:cols w:space="720"/>
@@ -2686,7 +3092,7 @@
 </file>
 
 <file path=word/endnotes.xml><?xml version="1.0" encoding="utf-8"?>
-<w:endnotes xmlns:wpc="http://schemas.microsoft.com/office/word/2010/wordprocessingCanvas" xmlns:cx="http://schemas.microsoft.com/office/drawing/2014/chartex" xmlns:cx1="http://schemas.microsoft.com/office/drawing/2015/9/8/chartex" xmlns:cx2="http://schemas.microsoft.com/office/drawing/2015/10/21/chartex" xmlns:cx3="http://schemas.microsoft.com/office/drawing/2016/5/9/chartex" xmlns:cx4="http://schemas.microsoft.com/office/drawing/2016/5/10/chartex" xmlns:cx5="http://schemas.microsoft.com/office/drawing/2016/5/11/chartex" xmlns:cx6="http://schemas.microsoft.com/office/drawing/2016/5/12/chartex" xmlns:cx7="http://schemas.microsoft.com/office/drawing/2016/5/13/chartex" xmlns:cx8="http://schemas.microsoft.com/office/drawing/2016/5/14/chartex" xmlns:mc="http://schemas.openxmlformats.org/markup-compatibility/2006" xmlns:aink="http://schemas.microsoft.com/office/drawing/2016/ink" xmlns:am3d="http://schemas.microsoft.com/office/drawing/2017/model3d" xmlns:o="urn:schemas-microsoft-com:office:office" xmlns:r="http://schemas.openxmlformats.org/officeDocument/2006/relationships" xmlns:m="http://schemas.openxmlformats.org/officeDocument/2006/math" xmlns:v="urn:schemas-microsoft-com:vml" xmlns:wp14="http://schemas.microsoft.com/office/word/2010/wordprocessingDrawing" xmlns:wp="http://schemas.openxmlformats.org/drawingml/2006/wordprocessingDrawing" xmlns:w10="urn:schemas-microsoft-com:office:word" xmlns:w="http://schemas.openxmlformats.org/wordprocessingml/2006/main" xmlns:w14="http://schemas.microsoft.com/office/word/2010/wordml" xmlns:w15="http://schemas.microsoft.com/office/word/2012/wordml" xmlns:w16cex="http://schemas.microsoft.com/office/word/2018/wordml/cex" xmlns:w16cid="http://schemas.microsoft.com/office/word/2016/wordml/cid" xmlns:w16="http://schemas.microsoft.com/office/word/2018/wordml" xmlns:w16sdtdh="http://schemas.microsoft.com/office/word/2020/wordml/sdtdatahash" xmlns:w16se="http://schemas.microsoft.com/office/word/2015/wordml/symex" xmlns:wpg="http://schemas.microsoft.com/office/word/2010/wordprocessingGroup" xmlns:wpi="http://schemas.microsoft.com/office/word/2010/wordprocessingInk" xmlns:wne="http://schemas.microsoft.com/office/word/2006/wordml" xmlns:wps="http://schemas.microsoft.com/office/word/2010/wordprocessingShape" mc:Ignorable="w14 w15 w16se w16cid w16 w16cex w16sdtdh wp14">
+<w:endnotes xmlns:wpc="http://schemas.microsoft.com/office/word/2010/wordprocessingCanvas" xmlns:cx="http://schemas.microsoft.com/office/drawing/2014/chartex" xmlns:cx1="http://schemas.microsoft.com/office/drawing/2015/9/8/chartex" xmlns:cx2="http://schemas.microsoft.com/office/drawing/2015/10/21/chartex" xmlns:cx3="http://schemas.microsoft.com/office/drawing/2016/5/9/chartex" xmlns:cx4="http://schemas.microsoft.com/office/drawing/2016/5/10/chartex" xmlns:cx5="http://schemas.microsoft.com/office/drawing/2016/5/11/chartex" xmlns:cx6="http://schemas.microsoft.com/office/drawing/2016/5/12/chartex" xmlns:cx7="http://schemas.microsoft.com/office/drawing/2016/5/13/chartex" xmlns:cx8="http://schemas.microsoft.com/office/drawing/2016/5/14/chartex" xmlns:mc="http://schemas.openxmlformats.org/markup-compatibility/2006" xmlns:aink="http://schemas.microsoft.com/office/drawing/2016/ink" xmlns:am3d="http://schemas.microsoft.com/office/drawing/2017/model3d" xmlns:o="urn:schemas-microsoft-com:office:office" xmlns:oel="http://schemas.microsoft.com/office/2019/extlst" xmlns:r="http://schemas.openxmlformats.org/officeDocument/2006/relationships" xmlns:m="http://schemas.openxmlformats.org/officeDocument/2006/math" xmlns:v="urn:schemas-microsoft-com:vml" xmlns:wp14="http://schemas.microsoft.com/office/word/2010/wordprocessingDrawing" xmlns:wp="http://schemas.openxmlformats.org/drawingml/2006/wordprocessingDrawing" xmlns:w10="urn:schemas-microsoft-com:office:word" xmlns:w="http://schemas.openxmlformats.org/wordprocessingml/2006/main" xmlns:w14="http://schemas.microsoft.com/office/word/2010/wordml" xmlns:w15="http://schemas.microsoft.com/office/word/2012/wordml" xmlns:w16cex="http://schemas.microsoft.com/office/word/2018/wordml/cex" xmlns:w16cid="http://schemas.microsoft.com/office/word/2016/wordml/cid" xmlns:w16="http://schemas.microsoft.com/office/word/2018/wordml" xmlns:w16du="http://schemas.microsoft.com/office/word/2023/wordml/word16du" xmlns:w16sdtdh="http://schemas.microsoft.com/office/word/2020/wordml/sdtdatahash" xmlns:w16sdtfl="http://schemas.microsoft.com/office/word/2024/wordml/sdtformatlock" xmlns:w16se="http://schemas.microsoft.com/office/word/2015/wordml/symex" xmlns:wpg="http://schemas.microsoft.com/office/word/2010/wordprocessingGroup" xmlns:wpi="http://schemas.microsoft.com/office/word/2010/wordprocessingInk" xmlns:wne="http://schemas.microsoft.com/office/word/2006/wordml" xmlns:wps="http://schemas.microsoft.com/office/word/2010/wordprocessingShape" mc:Ignorable="w14 w15 w16se w16cid w16 w16cex w16sdtdh w16sdtfl w16du wp14">
   <w:endnote w:type="separator" w:id="-1">
     <w:p>
       <w:r>
@@ -2705,7 +3111,7 @@
 </file>
 
 <file path=word/footer1.xml><?xml version="1.0" encoding="utf-8"?>
-<w:ftr xmlns:wpc="http://schemas.microsoft.com/office/word/2010/wordprocessingCanvas" xmlns:cx="http://schemas.microsoft.com/office/drawing/2014/chartex" xmlns:cx1="http://schemas.microsoft.com/office/drawing/2015/9/8/chartex" xmlns:cx2="http://schemas.microsoft.com/office/drawing/2015/10/21/chartex" xmlns:cx3="http://schemas.microsoft.com/office/drawing/2016/5/9/chartex" xmlns:cx4="http://schemas.microsoft.com/office/drawing/2016/5/10/chartex" xmlns:cx5="http://schemas.microsoft.com/office/drawing/2016/5/11/chartex" xmlns:cx6="http://schemas.microsoft.com/office/drawing/2016/5/12/chartex" xmlns:cx7="http://schemas.microsoft.com/office/drawing/2016/5/13/chartex" xmlns:cx8="http://schemas.microsoft.com/office/drawing/2016/5/14/chartex" xmlns:mc="http://schemas.openxmlformats.org/markup-compatibility/2006" xmlns:aink="http://schemas.microsoft.com/office/drawing/2016/ink" xmlns:am3d="http://schemas.microsoft.com/office/drawing/2017/model3d" xmlns:o="urn:schemas-microsoft-com:office:office" xmlns:r="http://schemas.openxmlformats.org/officeDocument/2006/relationships" xmlns:m="http://schemas.openxmlformats.org/officeDocument/2006/math" xmlns:v="urn:schemas-microsoft-com:vml" xmlns:wp14="http://schemas.microsoft.com/office/word/2010/wordprocessingDrawing" xmlns:wp="http://schemas.openxmlformats.org/drawingml/2006/wordprocessingDrawing" xmlns:w10="urn:schemas-microsoft-com:office:word" xmlns:w="http://schemas.openxmlformats.org/wordprocessingml/2006/main" xmlns:w14="http://schemas.microsoft.com/office/word/2010/wordml" xmlns:w15="http://schemas.microsoft.com/office/word/2012/wordml" xmlns:w16cex="http://schemas.microsoft.com/office/word/2018/wordml/cex" xmlns:w16cid="http://schemas.microsoft.com/office/word/2016/wordml/cid" xmlns:w16="http://schemas.microsoft.com/office/word/2018/wordml" xmlns:w16sdtdh="http://schemas.microsoft.com/office/word/2020/wordml/sdtdatahash" xmlns:w16se="http://schemas.microsoft.com/office/word/2015/wordml/symex" xmlns:wpg="http://schemas.microsoft.com/office/word/2010/wordprocessingGroup" xmlns:wpi="http://schemas.microsoft.com/office/word/2010/wordprocessingInk" xmlns:wne="http://schemas.microsoft.com/office/word/2006/wordml" xmlns:wps="http://schemas.microsoft.com/office/word/2010/wordprocessingShape" mc:Ignorable="w14 w15 w16se w16cid w16 w16cex w16sdtdh wp14">
+<w:ftr xmlns:wpc="http://schemas.microsoft.com/office/word/2010/wordprocessingCanvas" xmlns:cx="http://schemas.microsoft.com/office/drawing/2014/chartex" xmlns:cx1="http://schemas.microsoft.com/office/drawing/2015/9/8/chartex" xmlns:cx2="http://schemas.microsoft.com/office/drawing/2015/10/21/chartex" xmlns:cx3="http://schemas.microsoft.com/office/drawing/2016/5/9/chartex" xmlns:cx4="http://schemas.microsoft.com/office/drawing/2016/5/10/chartex" xmlns:cx5="http://schemas.microsoft.com/office/drawing/2016/5/11/chartex" xmlns:cx6="http://schemas.microsoft.com/office/drawing/2016/5/12/chartex" xmlns:cx7="http://schemas.microsoft.com/office/drawing/2016/5/13/chartex" xmlns:cx8="http://schemas.microsoft.com/office/drawing/2016/5/14/chartex" xmlns:mc="http://schemas.openxmlformats.org/markup-compatibility/2006" xmlns:aink="http://schemas.microsoft.com/office/drawing/2016/ink" xmlns:am3d="http://schemas.microsoft.com/office/drawing/2017/model3d" xmlns:o="urn:schemas-microsoft-com:office:office" xmlns:oel="http://schemas.microsoft.com/office/2019/extlst" xmlns:r="http://schemas.openxmlformats.org/officeDocument/2006/relationships" xmlns:m="http://schemas.openxmlformats.org/officeDocument/2006/math" xmlns:v="urn:schemas-microsoft-com:vml" xmlns:wp14="http://schemas.microsoft.com/office/word/2010/wordprocessingDrawing" xmlns:wp="http://schemas.openxmlformats.org/drawingml/2006/wordprocessingDrawing" xmlns:w10="urn:schemas-microsoft-com:office:word" xmlns:w="http://schemas.openxmlformats.org/wordprocessingml/2006/main" xmlns:w14="http://schemas.microsoft.com/office/word/2010/wordml" xmlns:w15="http://schemas.microsoft.com/office/word/2012/wordml" xmlns:w16cex="http://schemas.microsoft.com/office/word/2018/wordml/cex" xmlns:w16cid="http://schemas.microsoft.com/office/word/2016/wordml/cid" xmlns:w16="http://schemas.microsoft.com/office/word/2018/wordml" xmlns:w16du="http://schemas.microsoft.com/office/word/2023/wordml/word16du" xmlns:w16sdtdh="http://schemas.microsoft.com/office/word/2020/wordml/sdtdatahash" xmlns:w16sdtfl="http://schemas.microsoft.com/office/word/2024/wordml/sdtformatlock" xmlns:w16se="http://schemas.microsoft.com/office/word/2015/wordml/symex" xmlns:wpg="http://schemas.microsoft.com/office/word/2010/wordprocessingGroup" xmlns:wpi="http://schemas.microsoft.com/office/word/2010/wordprocessingInk" xmlns:wne="http://schemas.microsoft.com/office/word/2006/wordml" xmlns:wps="http://schemas.microsoft.com/office/word/2010/wordprocessingShape" mc:Ignorable="w14 w15 w16se w16cid w16 w16cex w16sdtdh w16sdtfl w16du wp14">
   <w:p>
     <w:pPr>
       <w:jc w:val="center"/>
@@ -2764,7 +3170,7 @@
 </file>
 
 <file path=word/footnotes.xml><?xml version="1.0" encoding="utf-8"?>
-<w:footnotes xmlns:wpc="http://schemas.microsoft.com/office/word/2010/wordprocessingCanvas" xmlns:cx="http://schemas.microsoft.com/office/drawing/2014/chartex" xmlns:cx1="http://schemas.microsoft.com/office/drawing/2015/9/8/chartex" xmlns:cx2="http://schemas.microsoft.com/office/drawing/2015/10/21/chartex" xmlns:cx3="http://schemas.microsoft.com/office/drawing/2016/5/9/chartex" xmlns:cx4="http://schemas.microsoft.com/office/drawing/2016/5/10/chartex" xmlns:cx5="http://schemas.microsoft.com/office/drawing/2016/5/11/chartex" xmlns:cx6="http://schemas.microsoft.com/office/drawing/2016/5/12/chartex" xmlns:cx7="http://schemas.microsoft.com/office/drawing/2016/5/13/chartex" xmlns:cx8="http://schemas.microsoft.com/office/drawing/2016/5/14/chartex" xmlns:mc="http://schemas.openxmlformats.org/markup-compatibility/2006" xmlns:aink="http://schemas.microsoft.com/office/drawing/2016/ink" xmlns:am3d="http://schemas.microsoft.com/office/drawing/2017/model3d" xmlns:o="urn:schemas-microsoft-com:office:office" xmlns:r="http://schemas.openxmlformats.org/officeDocument/2006/relationships" xmlns:m="http://schemas.openxmlformats.org/officeDocument/2006/math" xmlns:v="urn:schemas-microsoft-com:vml" xmlns:wp14="http://schemas.microsoft.com/office/word/2010/wordprocessingDrawing" xmlns:wp="http://schemas.openxmlformats.org/drawingml/2006/wordprocessingDrawing" xmlns:w10="urn:schemas-microsoft-com:office:word" xmlns:w="http://schemas.openxmlformats.org/wordprocessingml/2006/main" xmlns:w14="http://schemas.microsoft.com/office/word/2010/wordml" xmlns:w15="http://schemas.microsoft.com/office/word/2012/wordml" xmlns:w16cex="http://schemas.microsoft.com/office/word/2018/wordml/cex" xmlns:w16cid="http://schemas.microsoft.com/office/word/2016/wordml/cid" xmlns:w16="http://schemas.microsoft.com/office/word/2018/wordml" xmlns:w16sdtdh="http://schemas.microsoft.com/office/word/2020/wordml/sdtdatahash" xmlns:w16se="http://schemas.microsoft.com/office/word/2015/wordml/symex" xmlns:wpg="http://schemas.microsoft.com/office/word/2010/wordprocessingGroup" xmlns:wpi="http://schemas.microsoft.com/office/word/2010/wordprocessingInk" xmlns:wne="http://schemas.microsoft.com/office/word/2006/wordml" xmlns:wps="http://schemas.microsoft.com/office/word/2010/wordprocessingShape" mc:Ignorable="w14 w15 w16se w16cid w16 w16cex w16sdtdh wp14">
+<w:footnotes xmlns:wpc="http://schemas.microsoft.com/office/word/2010/wordprocessingCanvas" xmlns:cx="http://schemas.microsoft.com/office/drawing/2014/chartex" xmlns:cx1="http://schemas.microsoft.com/office/drawing/2015/9/8/chartex" xmlns:cx2="http://schemas.microsoft.com/office/drawing/2015/10/21/chartex" xmlns:cx3="http://schemas.microsoft.com/office/drawing/2016/5/9/chartex" xmlns:cx4="http://schemas.microsoft.com/office/drawing/2016/5/10/chartex" xmlns:cx5="http://schemas.microsoft.com/office/drawing/2016/5/11/chartex" xmlns:cx6="http://schemas.microsoft.com/office/drawing/2016/5/12/chartex" xmlns:cx7="http://schemas.microsoft.com/office/drawing/2016/5/13/chartex" xmlns:cx8="http://schemas.microsoft.com/office/drawing/2016/5/14/chartex" xmlns:mc="http://schemas.openxmlformats.org/markup-compatibility/2006" xmlns:aink="http://schemas.microsoft.com/office/drawing/2016/ink" xmlns:am3d="http://schemas.microsoft.com/office/drawing/2017/model3d" xmlns:o="urn:schemas-microsoft-com:office:office" xmlns:oel="http://schemas.microsoft.com/office/2019/extlst" xmlns:r="http://schemas.openxmlformats.org/officeDocument/2006/relationships" xmlns:m="http://schemas.openxmlformats.org/officeDocument/2006/math" xmlns:v="urn:schemas-microsoft-com:vml" xmlns:wp14="http://schemas.microsoft.com/office/word/2010/wordprocessingDrawing" xmlns:wp="http://schemas.openxmlformats.org/drawingml/2006/wordprocessingDrawing" xmlns:w10="urn:schemas-microsoft-com:office:word" xmlns:w="http://schemas.openxmlformats.org/wordprocessingml/2006/main" xmlns:w14="http://schemas.microsoft.com/office/word/2010/wordml" xmlns:w15="http://schemas.microsoft.com/office/word/2012/wordml" xmlns:w16cex="http://schemas.microsoft.com/office/word/2018/wordml/cex" xmlns:w16cid="http://schemas.microsoft.com/office/word/2016/wordml/cid" xmlns:w16="http://schemas.microsoft.com/office/word/2018/wordml" xmlns:w16du="http://schemas.microsoft.com/office/word/2023/wordml/word16du" xmlns:w16sdtdh="http://schemas.microsoft.com/office/word/2020/wordml/sdtdatahash" xmlns:w16sdtfl="http://schemas.microsoft.com/office/word/2024/wordml/sdtformatlock" xmlns:w16se="http://schemas.microsoft.com/office/word/2015/wordml/symex" xmlns:wpg="http://schemas.microsoft.com/office/word/2010/wordprocessingGroup" xmlns:wpi="http://schemas.microsoft.com/office/word/2010/wordprocessingInk" xmlns:wne="http://schemas.microsoft.com/office/word/2006/wordml" xmlns:wps="http://schemas.microsoft.com/office/word/2010/wordprocessingShape" mc:Ignorable="w14 w15 w16se w16cid w16 w16cex w16sdtdh w16sdtfl w16du wp14">
   <w:footnote w:type="separator" w:id="-1">
     <w:p>
       <w:r>
@@ -2782,8 +3188,132 @@
 </w:footnotes>
 </file>
 
+<file path=word/header1.xml><?xml version="1.0" encoding="utf-8"?>
+<w:hdr xmlns:wpc="http://schemas.microsoft.com/office/word/2010/wordprocessingCanvas" xmlns:cx="http://schemas.microsoft.com/office/drawing/2014/chartex" xmlns:cx1="http://schemas.microsoft.com/office/drawing/2015/9/8/chartex" xmlns:cx2="http://schemas.microsoft.com/office/drawing/2015/10/21/chartex" xmlns:cx3="http://schemas.microsoft.com/office/drawing/2016/5/9/chartex" xmlns:cx4="http://schemas.microsoft.com/office/drawing/2016/5/10/chartex" xmlns:cx5="http://schemas.microsoft.com/office/drawing/2016/5/11/chartex" xmlns:cx6="http://schemas.microsoft.com/office/drawing/2016/5/12/chartex" xmlns:cx7="http://schemas.microsoft.com/office/drawing/2016/5/13/chartex" xmlns:cx8="http://schemas.microsoft.com/office/drawing/2016/5/14/chartex" xmlns:mc="http://schemas.openxmlformats.org/markup-compatibility/2006" xmlns:aink="http://schemas.microsoft.com/office/drawing/2016/ink" xmlns:am3d="http://schemas.microsoft.com/office/drawing/2017/model3d" xmlns:o="urn:schemas-microsoft-com:office:office" xmlns:oel="http://schemas.microsoft.com/office/2019/extlst" xmlns:r="http://schemas.openxmlformats.org/officeDocument/2006/relationships" xmlns:m="http://schemas.openxmlformats.org/officeDocument/2006/math" xmlns:v="urn:schemas-microsoft-com:vml" xmlns:wp14="http://schemas.microsoft.com/office/word/2010/wordprocessingDrawing" xmlns:wp="http://schemas.openxmlformats.org/drawingml/2006/wordprocessingDrawing" xmlns:w10="urn:schemas-microsoft-com:office:word" xmlns:w="http://schemas.openxmlformats.org/wordprocessingml/2006/main" xmlns:w14="http://schemas.microsoft.com/office/word/2010/wordml" xmlns:w15="http://schemas.microsoft.com/office/word/2012/wordml" xmlns:w16cex="http://schemas.microsoft.com/office/word/2018/wordml/cex" xmlns:w16cid="http://schemas.microsoft.com/office/word/2016/wordml/cid" xmlns:w16="http://schemas.microsoft.com/office/word/2018/wordml" xmlns:w16du="http://schemas.microsoft.com/office/word/2023/wordml/word16du" xmlns:w16sdtdh="http://schemas.microsoft.com/office/word/2020/wordml/sdtdatahash" xmlns:w16sdtfl="http://schemas.microsoft.com/office/word/2024/wordml/sdtformatlock" xmlns:w16se="http://schemas.microsoft.com/office/word/2015/wordml/symex" xmlns:wpg="http://schemas.microsoft.com/office/word/2010/wordprocessingGroup" xmlns:wpi="http://schemas.microsoft.com/office/word/2010/wordprocessingInk" xmlns:wne="http://schemas.microsoft.com/office/word/2006/wordml" xmlns:wps="http://schemas.microsoft.com/office/word/2010/wordprocessingShape" mc:Ignorable="w14 w15 w16se w16cid w16 w16cex w16sdtdh w16sdtfl w16du wp14">
+  <w:p>
+    <w:pPr>
+      <w:pStyle w:val="Encabezado"/>
+    </w:pPr>
+    <w:r>
+      <w:rPr>
+        <w:noProof/>
+      </w:rPr>
+      <w:drawing>
+        <wp:anchor distT="0" distB="0" distL="114300" distR="114300" simplePos="0" relativeHeight="251660288" behindDoc="0" locked="0" layoutInCell="1" allowOverlap="1" wp14:anchorId="6FF59298" wp14:editId="5D03DE9F">
+          <wp:simplePos x="0" y="0"/>
+          <wp:positionH relativeFrom="column">
+            <wp:posOffset>7620</wp:posOffset>
+          </wp:positionH>
+          <wp:positionV relativeFrom="paragraph">
+            <wp:posOffset>-114300</wp:posOffset>
+          </wp:positionV>
+          <wp:extent cx="1823085" cy="446405"/>
+          <wp:effectExtent l="0" t="0" r="5715" b="0"/>
+          <wp:wrapNone/>
+          <wp:docPr id="2" name="Imagen 2" descr="Nuestra Universidad – Universidad Nacional Micaela Bastidas de Apurímac"/>
+          <wp:cNvGraphicFramePr/>
+          <a:graphic xmlns:a="http://schemas.openxmlformats.org/drawingml/2006/main">
+            <a:graphicData uri="http://schemas.openxmlformats.org/drawingml/2006/picture">
+              <pic:pic xmlns:pic="http://schemas.openxmlformats.org/drawingml/2006/picture">
+                <pic:nvPicPr>
+                  <pic:cNvPr id="2" name="Imagen 2" descr="Nuestra Universidad – Universidad Nacional Micaela Bastidas de Apurímac"/>
+                  <pic:cNvPicPr/>
+                </pic:nvPicPr>
+                <pic:blipFill>
+                  <a:blip r:embed="rId1">
+                    <a:extLst>
+                      <a:ext uri="{28A0092B-C50C-407E-A947-70E740481C1C}">
+                        <a14:useLocalDpi xmlns:a14="http://schemas.microsoft.com/office/drawing/2010/main" val="0"/>
+                      </a:ext>
+                    </a:extLst>
+                  </a:blip>
+                  <a:srcRect/>
+                  <a:stretch>
+                    <a:fillRect/>
+                  </a:stretch>
+                </pic:blipFill>
+                <pic:spPr bwMode="auto">
+                  <a:xfrm>
+                    <a:off x="0" y="0"/>
+                    <a:ext cx="1823085" cy="446405"/>
+                  </a:xfrm>
+                  <a:prstGeom prst="rect">
+                    <a:avLst/>
+                  </a:prstGeom>
+                  <a:noFill/>
+                  <a:ln>
+                    <a:noFill/>
+                  </a:ln>
+                </pic:spPr>
+              </pic:pic>
+            </a:graphicData>
+          </a:graphic>
+        </wp:anchor>
+      </w:drawing>
+    </w:r>
+    <w:r>
+      <w:rPr>
+        <w:noProof/>
+      </w:rPr>
+      <w:drawing>
+        <wp:anchor distT="0" distB="0" distL="114300" distR="114300" simplePos="0" relativeHeight="251659264" behindDoc="0" locked="0" layoutInCell="1" allowOverlap="1" wp14:anchorId="41D696B5" wp14:editId="70328421">
+          <wp:simplePos x="0" y="0"/>
+          <wp:positionH relativeFrom="column">
+            <wp:posOffset>5577205</wp:posOffset>
+          </wp:positionH>
+          <wp:positionV relativeFrom="paragraph">
+            <wp:posOffset>-168275</wp:posOffset>
+          </wp:positionV>
+          <wp:extent cx="519430" cy="519430"/>
+          <wp:effectExtent l="0" t="0" r="0" b="0"/>
+          <wp:wrapNone/>
+          <wp:docPr id="1" name="Imagen 1" descr="Ingeniería Informática y Sistemas – Universidad Nacional Micaela Bastidas  de Apurímac"/>
+          <wp:cNvGraphicFramePr/>
+          <a:graphic xmlns:a="http://schemas.openxmlformats.org/drawingml/2006/main">
+            <a:graphicData uri="http://schemas.openxmlformats.org/drawingml/2006/picture">
+              <pic:pic xmlns:pic="http://schemas.openxmlformats.org/drawingml/2006/picture">
+                <pic:nvPicPr>
+                  <pic:cNvPr id="1" name="Imagen 1" descr="Ingeniería Informática y Sistemas – Universidad Nacional Micaela Bastidas  de Apurímac"/>
+                  <pic:cNvPicPr/>
+                </pic:nvPicPr>
+                <pic:blipFill>
+                  <a:blip r:embed="rId2">
+                    <a:extLst>
+                      <a:ext uri="{28A0092B-C50C-407E-A947-70E740481C1C}">
+                        <a14:useLocalDpi xmlns:a14="http://schemas.microsoft.com/office/drawing/2010/main" val="0"/>
+                      </a:ext>
+                    </a:extLst>
+                  </a:blip>
+                  <a:srcRect/>
+                  <a:stretch>
+                    <a:fillRect/>
+                  </a:stretch>
+                </pic:blipFill>
+                <pic:spPr bwMode="auto">
+                  <a:xfrm>
+                    <a:off x="0" y="0"/>
+                    <a:ext cx="519430" cy="519430"/>
+                  </a:xfrm>
+                  <a:prstGeom prst="rect">
+                    <a:avLst/>
+                  </a:prstGeom>
+                  <a:noFill/>
+                  <a:ln>
+                    <a:noFill/>
+                  </a:ln>
+                </pic:spPr>
+              </pic:pic>
+            </a:graphicData>
+          </a:graphic>
+        </wp:anchor>
+      </w:drawing>
+    </w:r>
+  </w:p>
+</w:hdr>
+</file>
+
 <file path=word/numbering.xml><?xml version="1.0" encoding="utf-8"?>
-<w:numbering xmlns:wpc="http://schemas.microsoft.com/office/word/2010/wordprocessingCanvas" xmlns:cx="http://schemas.microsoft.com/office/drawing/2014/chartex" xmlns:cx1="http://schemas.microsoft.com/office/drawing/2015/9/8/chartex" xmlns:cx2="http://schemas.microsoft.com/office/drawing/2015/10/21/chartex" xmlns:cx3="http://schemas.microsoft.com/office/drawing/2016/5/9/chartex" xmlns:cx4="http://schemas.microsoft.com/office/drawing/2016/5/10/chartex" xmlns:cx5="http://schemas.microsoft.com/office/drawing/2016/5/11/chartex" xmlns:cx6="http://schemas.microsoft.com/office/drawing/2016/5/12/chartex" xmlns:cx7="http://schemas.microsoft.com/office/drawing/2016/5/13/chartex" xmlns:cx8="http://schemas.microsoft.com/office/drawing/2016/5/14/chartex" xmlns:mc="http://schemas.openxmlformats.org/markup-compatibility/2006" xmlns:aink="http://schemas.microsoft.com/office/drawing/2016/ink" xmlns:am3d="http://schemas.microsoft.com/office/drawing/2017/model3d" xmlns:o="urn:schemas-microsoft-com:office:office" xmlns:r="http://schemas.openxmlformats.org/officeDocument/2006/relationships" xmlns:m="http://schemas.openxmlformats.org/officeDocument/2006/math" xmlns:v="urn:schemas-microsoft-com:vml" xmlns:wp14="http://schemas.microsoft.com/office/word/2010/wordprocessingDrawing" xmlns:wp="http://schemas.openxmlformats.org/drawingml/2006/wordprocessingDrawing" xmlns:w10="urn:schemas-microsoft-com:office:word" xmlns:w="http://schemas.openxmlformats.org/wordprocessingml/2006/main" xmlns:w14="http://schemas.microsoft.com/office/word/2010/wordml" xmlns:w15="http://schemas.microsoft.com/office/word/2012/wordml" xmlns:w16cex="http://schemas.microsoft.com/office/word/2018/wordml/cex" xmlns:w16cid="http://schemas.microsoft.com/office/word/2016/wordml/cid" xmlns:w16="http://schemas.microsoft.com/office/word/2018/wordml" xmlns:w16sdtdh="http://schemas.microsoft.com/office/word/2020/wordml/sdtdatahash" xmlns:w16se="http://schemas.microsoft.com/office/word/2015/wordml/symex" xmlns:wpg="http://schemas.microsoft.com/office/word/2010/wordprocessingGroup" xmlns:wpi="http://schemas.microsoft.com/office/word/2010/wordprocessingInk" xmlns:wne="http://schemas.microsoft.com/office/word/2006/wordml" xmlns:wps="http://schemas.microsoft.com/office/word/2010/wordprocessingShape" mc:Ignorable="w14 w15 w16se w16cid w16 w16cex w16sdtdh wp14">
+<w:numbering xmlns:wpc="http://schemas.microsoft.com/office/word/2010/wordprocessingCanvas" xmlns:cx="http://schemas.microsoft.com/office/drawing/2014/chartex" xmlns:cx1="http://schemas.microsoft.com/office/drawing/2015/9/8/chartex" xmlns:cx2="http://schemas.microsoft.com/office/drawing/2015/10/21/chartex" xmlns:cx3="http://schemas.microsoft.com/office/drawing/2016/5/9/chartex" xmlns:cx4="http://schemas.microsoft.com/office/drawing/2016/5/10/chartex" xmlns:cx5="http://schemas.microsoft.com/office/drawing/2016/5/11/chartex" xmlns:cx6="http://schemas.microsoft.com/office/drawing/2016/5/12/chartex" xmlns:cx7="http://schemas.microsoft.com/office/drawing/2016/5/13/chartex" xmlns:cx8="http://schemas.microsoft.com/office/drawing/2016/5/14/chartex" xmlns:mc="http://schemas.openxmlformats.org/markup-compatibility/2006" xmlns:aink="http://schemas.microsoft.com/office/drawing/2016/ink" xmlns:am3d="http://schemas.microsoft.com/office/drawing/2017/model3d" xmlns:o="urn:schemas-microsoft-com:office:office" xmlns:oel="http://schemas.microsoft.com/office/2019/extlst" xmlns:r="http://schemas.openxmlformats.org/officeDocument/2006/relationships" xmlns:m="http://schemas.openxmlformats.org/officeDocument/2006/math" xmlns:v="urn:schemas-microsoft-com:vml" xmlns:wp14="http://schemas.microsoft.com/office/word/2010/wordprocessingDrawing" xmlns:wp="http://schemas.openxmlformats.org/drawingml/2006/wordprocessingDrawing" xmlns:w10="urn:schemas-microsoft-com:office:word" xmlns:w="http://schemas.openxmlformats.org/wordprocessingml/2006/main" xmlns:w14="http://schemas.microsoft.com/office/word/2010/wordml" xmlns:w15="http://schemas.microsoft.com/office/word/2012/wordml" xmlns:w16cex="http://schemas.microsoft.com/office/word/2018/wordml/cex" xmlns:w16cid="http://schemas.microsoft.com/office/word/2016/wordml/cid" xmlns:w16="http://schemas.microsoft.com/office/word/2018/wordml" xmlns:w16du="http://schemas.microsoft.com/office/word/2023/wordml/word16du" xmlns:w16sdtdh="http://schemas.microsoft.com/office/word/2020/wordml/sdtdatahash" xmlns:w16sdtfl="http://schemas.microsoft.com/office/word/2024/wordml/sdtformatlock" xmlns:w16se="http://schemas.microsoft.com/office/word/2015/wordml/symex" xmlns:wpg="http://schemas.microsoft.com/office/word/2010/wordprocessingGroup" xmlns:wpi="http://schemas.microsoft.com/office/word/2010/wordprocessingInk" xmlns:wne="http://schemas.microsoft.com/office/word/2006/wordml" xmlns:wps="http://schemas.microsoft.com/office/word/2010/wordprocessingShape" mc:Ignorable="w14 w15 w16se w16cid w16 w16cex w16sdtdh w16sdtfl w16du wp14">
   <w:abstractNum w:abstractNumId="0" w15:restartNumberingAfterBreak="0">
     <w:nsid w:val="336019AA"/>
     <w:multiLevelType w:val="hybridMultilevel"/>
@@ -2978,17 +3508,109 @@
       <w:lvlJc w:val="left"/>
     </w:lvl>
   </w:abstractNum>
-  <w:num w:numId="1">
+  <w:abstractNum w:abstractNumId="3" w15:restartNumberingAfterBreak="0">
+    <w:nsid w:val="66354E0D"/>
+    <w:multiLevelType w:val="hybridMultilevel"/>
+    <w:tmpl w:val="063EF7A8"/>
+    <w:lvl w:ilvl="0" w:tplc="280A000F">
+      <w:start w:val="1"/>
+      <w:numFmt w:val="decimal"/>
+      <w:lvlText w:val="%1."/>
+      <w:lvlJc w:val="left"/>
+      <w:pPr>
+        <w:ind w:left="360" w:hanging="360"/>
+      </w:pPr>
+      <w:rPr>
+        <w:rFonts w:hint="default"/>
+      </w:rPr>
+    </w:lvl>
+    <w:lvl w:ilvl="1" w:tplc="280A0019" w:tentative="1">
+      <w:start w:val="1"/>
+      <w:numFmt w:val="lowerLetter"/>
+      <w:lvlText w:val="%2."/>
+      <w:lvlJc w:val="left"/>
+      <w:pPr>
+        <w:ind w:left="1080" w:hanging="360"/>
+      </w:pPr>
+    </w:lvl>
+    <w:lvl w:ilvl="2" w:tplc="280A001B" w:tentative="1">
+      <w:start w:val="1"/>
+      <w:numFmt w:val="lowerRoman"/>
+      <w:lvlText w:val="%3."/>
+      <w:lvlJc w:val="right"/>
+      <w:pPr>
+        <w:ind w:left="1800" w:hanging="180"/>
+      </w:pPr>
+    </w:lvl>
+    <w:lvl w:ilvl="3" w:tplc="280A000F" w:tentative="1">
+      <w:start w:val="1"/>
+      <w:numFmt w:val="decimal"/>
+      <w:lvlText w:val="%4."/>
+      <w:lvlJc w:val="left"/>
+      <w:pPr>
+        <w:ind w:left="2520" w:hanging="360"/>
+      </w:pPr>
+    </w:lvl>
+    <w:lvl w:ilvl="4" w:tplc="280A0019" w:tentative="1">
+      <w:start w:val="1"/>
+      <w:numFmt w:val="lowerLetter"/>
+      <w:lvlText w:val="%5."/>
+      <w:lvlJc w:val="left"/>
+      <w:pPr>
+        <w:ind w:left="3240" w:hanging="360"/>
+      </w:pPr>
+    </w:lvl>
+    <w:lvl w:ilvl="5" w:tplc="280A001B" w:tentative="1">
+      <w:start w:val="1"/>
+      <w:numFmt w:val="lowerRoman"/>
+      <w:lvlText w:val="%6."/>
+      <w:lvlJc w:val="right"/>
+      <w:pPr>
+        <w:ind w:left="3960" w:hanging="180"/>
+      </w:pPr>
+    </w:lvl>
+    <w:lvl w:ilvl="6" w:tplc="280A000F" w:tentative="1">
+      <w:start w:val="1"/>
+      <w:numFmt w:val="decimal"/>
+      <w:lvlText w:val="%7."/>
+      <w:lvlJc w:val="left"/>
+      <w:pPr>
+        <w:ind w:left="4680" w:hanging="360"/>
+      </w:pPr>
+    </w:lvl>
+    <w:lvl w:ilvl="7" w:tplc="280A0019" w:tentative="1">
+      <w:start w:val="1"/>
+      <w:numFmt w:val="lowerLetter"/>
+      <w:lvlText w:val="%8."/>
+      <w:lvlJc w:val="left"/>
+      <w:pPr>
+        <w:ind w:left="5400" w:hanging="360"/>
+      </w:pPr>
+    </w:lvl>
+    <w:lvl w:ilvl="8" w:tplc="280A001B" w:tentative="1">
+      <w:start w:val="1"/>
+      <w:numFmt w:val="lowerRoman"/>
+      <w:lvlText w:val="%9."/>
+      <w:lvlJc w:val="right"/>
+      <w:pPr>
+        <w:ind w:left="6120" w:hanging="180"/>
+      </w:pPr>
+    </w:lvl>
+  </w:abstractNum>
+  <w:num w:numId="1" w16cid:durableId="1962220974">
     <w:abstractNumId w:val="1"/>
     <w:lvlOverride w:ilvl="0">
       <w:startOverride w:val="1"/>
     </w:lvlOverride>
   </w:num>
+  <w:num w:numId="2" w16cid:durableId="1275746676">
+    <w:abstractNumId w:val="3"/>
+  </w:num>
 </w:numbering>
 </file>
 
 <file path=word/styles.xml><?xml version="1.0" encoding="utf-8"?>
-<w:styles xmlns:mc="http://schemas.openxmlformats.org/markup-compatibility/2006" xmlns:r="http://schemas.openxmlformats.org/officeDocument/2006/relationships" xmlns:w="http://schemas.openxmlformats.org/wordprocessingml/2006/main" xmlns:w14="http://schemas.microsoft.com/office/word/2010/wordml" xmlns:w15="http://schemas.microsoft.com/office/word/2012/wordml" xmlns:w16cex="http://schemas.microsoft.com/office/word/2018/wordml/cex" xmlns:w16cid="http://schemas.microsoft.com/office/word/2016/wordml/cid" xmlns:w16="http://schemas.microsoft.com/office/word/2018/wordml" xmlns:w16sdtdh="http://schemas.microsoft.com/office/word/2020/wordml/sdtdatahash" xmlns:w16se="http://schemas.microsoft.com/office/word/2015/wordml/symex" mc:Ignorable="w14 w15 w16se w16cid w16 w16cex w16sdtdh">
+<w:styles xmlns:mc="http://schemas.openxmlformats.org/markup-compatibility/2006" xmlns:r="http://schemas.openxmlformats.org/officeDocument/2006/relationships" xmlns:w="http://schemas.openxmlformats.org/wordprocessingml/2006/main" xmlns:w14="http://schemas.microsoft.com/office/word/2010/wordml" xmlns:w15="http://schemas.microsoft.com/office/word/2012/wordml" xmlns:w16cex="http://schemas.microsoft.com/office/word/2018/wordml/cex" xmlns:w16cid="http://schemas.microsoft.com/office/word/2016/wordml/cid" xmlns:w16="http://schemas.microsoft.com/office/word/2018/wordml" xmlns:w16du="http://schemas.microsoft.com/office/word/2023/wordml/word16du" xmlns:w16sdtdh="http://schemas.microsoft.com/office/word/2020/wordml/sdtdatahash" xmlns:w16sdtfl="http://schemas.microsoft.com/office/word/2024/wordml/sdtformatlock" xmlns:w16se="http://schemas.microsoft.com/office/word/2015/wordml/symex" mc:Ignorable="w14 w15 w16se w16cid w16 w16cex w16sdtdh w16sdtfl w16du">
   <w:docDefaults>
     <w:rPrDefault>
       <w:rPr>
@@ -3743,6 +4365,48 @@
     <w:semiHidden/>
     <w:unhideWhenUsed/>
   </w:style>
+  <w:style w:type="paragraph" w:styleId="Encabezado">
+    <w:name w:val="header"/>
+    <w:basedOn w:val="Normal"/>
+    <w:link w:val="EncabezadoCar"/>
+    <w:uiPriority w:val="99"/>
+    <w:unhideWhenUsed/>
+    <w:rsid w:val="00FE3904"/>
+    <w:pPr>
+      <w:tabs>
+        <w:tab w:val="center" w:pos="4252"/>
+        <w:tab w:val="right" w:pos="8504"/>
+      </w:tabs>
+    </w:pPr>
+  </w:style>
+  <w:style w:type="character" w:customStyle="1" w:styleId="EncabezadoCar">
+    <w:name w:val="Encabezado Car"/>
+    <w:basedOn w:val="Fuentedeprrafopredeter"/>
+    <w:link w:val="Encabezado"/>
+    <w:uiPriority w:val="99"/>
+    <w:rsid w:val="00FE3904"/>
+  </w:style>
+  <w:style w:type="paragraph" w:styleId="Piedepgina">
+    <w:name w:val="footer"/>
+    <w:basedOn w:val="Normal"/>
+    <w:link w:val="PiedepginaCar"/>
+    <w:uiPriority w:val="99"/>
+    <w:unhideWhenUsed/>
+    <w:rsid w:val="00FE3904"/>
+    <w:pPr>
+      <w:tabs>
+        <w:tab w:val="center" w:pos="4252"/>
+        <w:tab w:val="right" w:pos="8504"/>
+      </w:tabs>
+    </w:pPr>
+  </w:style>
+  <w:style w:type="character" w:customStyle="1" w:styleId="PiedepginaCar">
+    <w:name w:val="Pie de página Car"/>
+    <w:basedOn w:val="Fuentedeprrafopredeter"/>
+    <w:link w:val="Piedepgina"/>
+    <w:uiPriority w:val="99"/>
+    <w:rsid w:val="00FE3904"/>
+  </w:style>
 </w:styles>
 </file>
 

</xml_diff>